<commit_message>
Updated documentation and other minor cleanup.
</commit_message>
<xml_diff>
--- a/docs/LANDIS-II Social-Climate-Fire v4 User Guide.docx
+++ b/docs/LANDIS-II Social-Climate-Fire v4 User Guide.docx
@@ -9067,7 +9067,6 @@
         </w:rPr>
         <w:t xml:space="preserve">Social-Climate </w:t>
       </w:r>
-      <w:proofErr w:type="gramStart"/>
       <w:r>
         <w:rPr>
           <w:color w:val="333333"/>
@@ -9079,14 +9078,7 @@
         <w:rPr>
           <w:color w:val="333333"/>
         </w:rPr>
-        <w:t>(‘</w:t>
-      </w:r>
-      <w:proofErr w:type="gramEnd"/>
-      <w:r>
-        <w:rPr>
-          <w:color w:val="333333"/>
-        </w:rPr>
-        <w:t xml:space="preserve">SCF’) </w:t>
+        <w:t xml:space="preserve">(‘SCF’) </w:t>
       </w:r>
       <w:r>
         <w:t>e</w:t>
@@ -9178,13 +9170,8 @@
       <w:r>
         <w:t xml:space="preserve">behave similarly </w:t>
       </w:r>
-      <w:proofErr w:type="gramStart"/>
-      <w:r>
-        <w:t>in regards to</w:t>
-      </w:r>
-      <w:proofErr w:type="gramEnd"/>
-      <w:r>
-        <w:t xml:space="preserve"> spread and mortality.</w:t>
+      <w:r>
+        <w:t>in regards to spread and mortality.</w:t>
       </w:r>
       <w:r>
         <w:t xml:space="preserve">  Our model consists of </w:t>
@@ -9233,11 +9220,9 @@
       <w:r>
         <w:t xml:space="preserve">upply of ignitions </w:t>
       </w:r>
-      <w:proofErr w:type="gramStart"/>
       <w:r>
         <w:t>are</w:t>
       </w:r>
-      <w:proofErr w:type="gramEnd"/>
       <w:r>
         <w:t xml:space="preserve"> generated from </w:t>
       </w:r>
@@ -9354,11 +9339,9 @@
         <w:pStyle w:val="textbody"/>
         <w:ind w:left="720"/>
       </w:pPr>
-      <w:proofErr w:type="gramStart"/>
       <w:r>
         <w:t>where</w:t>
       </w:r>
-      <w:proofErr w:type="gramEnd"/>
     </w:p>
     <w:p>
       <w:pPr>
@@ -9515,13 +9498,8 @@
       <w:r>
         <w:t>Number of fires =</w:t>
       </w:r>
-      <w:proofErr w:type="gramStart"/>
-      <w:r>
-        <w:t>Pois(</w:t>
-      </w:r>
-      <w:proofErr w:type="gramEnd"/>
-      <w:r>
-        <w:t>Lambda=</w:t>
+      <w:r>
+        <w:t>Pois(Lambda=</w:t>
       </w:r>
       <m:oMath>
         <m:sSup>
@@ -9577,42 +9555,10 @@
         <w:ind w:left="720"/>
       </w:pPr>
       <w:r>
-        <w:t xml:space="preserve">This requires fitting four-parameters to the model by ignition type. The second distribution type is </w:t>
-      </w:r>
-      <w:proofErr w:type="gramStart"/>
-      <w:r>
-        <w:t>the Poisson</w:t>
-      </w:r>
-      <w:proofErr w:type="gramEnd"/>
-      <w:r>
-        <w:t xml:space="preserve">, in which only Equation 3 </w:t>
-      </w:r>
-      <w:proofErr w:type="gramStart"/>
-      <w:r>
-        <w:t>is fit to</w:t>
-      </w:r>
-      <w:proofErr w:type="gramEnd"/>
-      <w:r>
-        <w:t xml:space="preserve"> the data. This requires fitting only </w:t>
-      </w:r>
-      <w:proofErr w:type="gramStart"/>
-      <w:r>
-        <w:t>two-parameters</w:t>
-      </w:r>
-      <w:proofErr w:type="gramEnd"/>
-      <w:r>
-        <w:t xml:space="preserve">.  For both modes, </w:t>
-      </w:r>
-      <w:r>
-        <w:t>Fire Weather Index (FWI) follows the calculations from the Canadian Fire Prediction System (1992) and is a smoothed averaged that integrates long- and short-term variation in precipitation and temperature.  FWI was calculated for each day-of-the-</w:t>
-      </w:r>
-      <w:proofErr w:type="gramStart"/>
-      <w:r>
-        <w:t>year</w:t>
-      </w:r>
-      <w:proofErr w:type="gramEnd"/>
-      <w:r>
-        <w:t xml:space="preserve"> and the appropriate number of ignitions were generated for each day</w:t>
+        <w:t xml:space="preserve">This requires fitting four-parameters to the model by ignition type. The second distribution type is the Poisson, in which only Equation 3 is fit to the data. This requires fitting only two-parameters.  For both modes, </w:t>
+      </w:r>
+      <w:r>
+        <w:t>Fire Weather Index (FWI) follows the calculations from the Canadian Fire Prediction System (1992) and is a smoothed averaged that integrates long- and short-term variation in precipitation and temperature.  FWI was calculated for each day-of-the-year and the appropriate number of ignitions were generated for each day</w:t>
       </w:r>
       <w:r>
         <w:t>.</w:t>
@@ -9761,23 +9707,7 @@
         <w:ind w:left="720"/>
       </w:pPr>
       <w:r>
-        <w:t xml:space="preserve">From the point of ignition, fire spreads. Fire can spread to each adjacent cell dependent upon a probability of </w:t>
-      </w:r>
-      <w:proofErr w:type="gramStart"/>
-      <w:r>
-        <w:t>spread</w:t>
-      </w:r>
-      <w:proofErr w:type="gramEnd"/>
-      <w:r>
-        <w:t xml:space="preserve"> to adjacent </w:t>
-      </w:r>
-      <w:proofErr w:type="gramStart"/>
-      <w:r>
-        <w:t>neighbor</w:t>
-      </w:r>
-      <w:proofErr w:type="gramEnd"/>
-      <w:r>
-        <w:t xml:space="preserve"> (out of four nearest neighbors). Fire spread is from cell-to-cell and determines fire size. A fire will continue burning until no more cells are selected for spread.  </w:t>
+        <w:t xml:space="preserve">From the point of ignition, fire spreads. Fire can spread to each adjacent cell dependent upon a probability of spread to adjacent neighbor (out of four nearest neighbors). Fire spread is from cell-to-cell and determines fire size. A fire will continue burning until no more cells are selected for spread.  </w:t>
       </w:r>
     </w:p>
     <w:p>
@@ -10020,24 +9950,13 @@
           <w:b/>
         </w:rPr>
         <w:lastRenderedPageBreak/>
-        <w:t>Note here and elsewhere</w:t>
-      </w:r>
-      <w:proofErr w:type="gramStart"/>
-      <w:r>
-        <w:rPr>
-          <w:b/>
-        </w:rPr>
-        <w:t>:</w:t>
+        <w:t>Note here and elsewhere:</w:t>
       </w:r>
       <w:r>
         <w:t xml:space="preserve">  </w:t>
       </w:r>
       <w:r>
-        <w:t>The</w:t>
-      </w:r>
-      <w:proofErr w:type="gramEnd"/>
-      <w:r>
-        <w:t xml:space="preserve"> climate library converts all wind speed units into kilometers / hour.</w:t>
+        <w:t>The climate library converts all wind speed units into kilometers / hour.</w:t>
       </w:r>
       <w:r>
         <w:t xml:space="preserve">  </w:t>
@@ -10046,21 +9965,7 @@
         <w:rPr>
           <w:i/>
         </w:rPr>
-        <w:t xml:space="preserve">Be sure to convert your wind data into the correct units when </w:t>
-      </w:r>
-      <w:proofErr w:type="gramStart"/>
-      <w:r>
-        <w:rPr>
-          <w:i/>
-        </w:rPr>
-        <w:t>inputting</w:t>
-      </w:r>
-      <w:proofErr w:type="gramEnd"/>
-      <w:r>
-        <w:rPr>
-          <w:i/>
-        </w:rPr>
-        <w:t xml:space="preserve"> into the climate library.</w:t>
+        <w:t>Be sure to convert your wind data into the correct units when inputting into the climate library.</w:t>
       </w:r>
     </w:p>
     <w:p>
@@ -10105,15 +10010,7 @@
         <w:t>A fire will spread</w:t>
       </w:r>
       <w:r>
-        <w:t xml:space="preserve"> (if it does not </w:t>
-      </w:r>
-      <w:proofErr w:type="gramStart"/>
-      <w:r>
-        <w:t>fail to</w:t>
-      </w:r>
-      <w:proofErr w:type="gramEnd"/>
-      <w:r>
-        <w:t xml:space="preserve"> or is not suppressed)</w:t>
+        <w:t xml:space="preserve"> (if it does not fail to or is not suppressed)</w:t>
       </w:r>
       <w:r>
         <w:t xml:space="preserve"> until it has reach</w:t>
@@ -10200,15 +10097,7 @@
         <w:t xml:space="preserve">). </w:t>
       </w:r>
       <w:r>
-        <w:t xml:space="preserve">In simulations, cell-to-cell and maximum daily fire spread are updated separately with daily FWI estimates until the fire can no longer spread (e.g. disconnected fuels), FWI levels </w:t>
-      </w:r>
-      <w:proofErr w:type="gramStart"/>
-      <w:r>
-        <w:t>reduces</w:t>
-      </w:r>
-      <w:proofErr w:type="gramEnd"/>
-      <w:r>
-        <w:t xml:space="preserve"> spread rates, or suppression is applied.</w:t>
+        <w:t>In simulations, cell-to-cell and maximum daily fire spread are updated separately with daily FWI estimates until the fire can no longer spread (e.g. disconnected fuels), FWI levels reduces spread rates, or suppression is applied.</w:t>
       </w:r>
     </w:p>
     <w:p>
@@ -10334,13 +10223,8 @@
         </w:rPr>
         <w:t>intensity</w:t>
       </w:r>
-      <w:proofErr w:type="gramStart"/>
-      <w:r>
-        <w:t>:  Early</w:t>
-      </w:r>
-      <w:proofErr w:type="gramEnd"/>
-      <w:r>
-        <w:t xml:space="preserve"> versions of SC</w:t>
+      <w:r>
+        <w:t>:  Early versions of SC</w:t>
       </w:r>
       <w:r>
         <w:t>F</w:t>
@@ -10393,15 +10277,7 @@
       </w:r>
       <w:proofErr w:type="spellEnd"/>
       <w:r>
-        <w:t xml:space="preserve"> style maps). This represents the cells experience of mortality without </w:t>
-      </w:r>
-      <w:proofErr w:type="gramStart"/>
-      <w:r>
-        <w:t>regard</w:t>
-      </w:r>
-      <w:proofErr w:type="gramEnd"/>
-      <w:r>
-        <w:t xml:space="preserve"> individual species presence. Site level severity is calculated as </w:t>
+        <w:t xml:space="preserve"> style maps). This represents the cells experience of mortality without regard individual species presence. Site level severity is calculated as </w:t>
       </w:r>
       <w:r>
         <w:t xml:space="preserve">with an </w:t>
@@ -10816,14 +10692,12 @@
         <w:pStyle w:val="textbody"/>
         <w:ind w:left="720"/>
       </w:pPr>
-      <w:proofErr w:type="gramStart"/>
       <w:r>
         <w:t>w</w:t>
       </w:r>
       <w:r>
         <w:t>here</w:t>
       </w:r>
-      <w:proofErr w:type="gramEnd"/>
       <w:r>
         <w:t>,</w:t>
       </w:r>
@@ -10977,18 +10851,10 @@
         <w:ind w:left="720"/>
       </w:pPr>
       <w:r>
-        <w:t>As indicated by Robbins et al. (</w:t>
-      </w:r>
-      <w:proofErr w:type="gramStart"/>
-      <w:r>
-        <w:t>2022)</w:t>
-      </w:r>
-      <w:r>
-        <w:t>(</w:t>
-      </w:r>
-      <w:proofErr w:type="gramEnd"/>
-      <w:r>
-        <w:t>S1)</w:t>
+        <w:t>As indicated by Robbins et al. (2022)</w:t>
+      </w:r>
+      <w:r>
+        <w:t>(S1)</w:t>
       </w:r>
       <w:r>
         <w:t xml:space="preserve"> and paraphrased here for length:</w:t>
@@ -12134,7 +12000,6 @@
       <w:r>
         <w:t>”</w:t>
       </w:r>
-      <w:proofErr w:type="gramStart"/>
       <w:r>
         <w:t>,”</w:t>
       </w:r>
@@ -12143,7 +12008,6 @@
         <w:t>MaximumBarkThickness</w:t>
       </w:r>
       <w:proofErr w:type="spellEnd"/>
-      <w:proofErr w:type="gramEnd"/>
       <w:r>
         <w:t xml:space="preserve">”. Each row should be a species </w:t>
       </w:r>
@@ -12171,14 +12035,14 @@
         <w:pStyle w:val="Heading2"/>
         <w:spacing w:after="120"/>
       </w:pPr>
-      <w:bookmarkStart w:id="38" w:name="_Toc136162634"/>
-      <w:bookmarkStart w:id="39" w:name="_Ref272935309"/>
-      <w:bookmarkStart w:id="40" w:name="_Toc233896137"/>
+      <w:bookmarkStart w:id="38" w:name="_Toc233896137"/>
+      <w:bookmarkStart w:id="39" w:name="_Toc136162634"/>
+      <w:bookmarkStart w:id="40" w:name="_Ref272935309"/>
       <w:proofErr w:type="spellStart"/>
       <w:r>
         <w:t>AccidentalIgnitionsMap</w:t>
       </w:r>
-      <w:bookmarkEnd w:id="40"/>
+      <w:bookmarkEnd w:id="38"/>
       <w:proofErr w:type="spellEnd"/>
     </w:p>
     <w:p>
@@ -12552,10 +12416,10 @@
         <w:pStyle w:val="Heading2"/>
         <w:spacing w:after="120"/>
       </w:pPr>
-      <w:bookmarkStart w:id="43" w:name="_Toc136162636"/>
-      <w:bookmarkStart w:id="44" w:name="_Toc233896140"/>
-      <w:bookmarkEnd w:id="38"/>
+      <w:bookmarkStart w:id="43" w:name="_Toc233896140"/>
+      <w:bookmarkStart w:id="44" w:name="_Toc136162636"/>
       <w:bookmarkEnd w:id="39"/>
+      <w:bookmarkEnd w:id="40"/>
       <w:proofErr w:type="spellStart"/>
       <w:r>
         <w:t>DynamicLightningIgnitionMaps</w:t>
@@ -12564,7 +12428,7 @@
       <w:r>
         <w:t xml:space="preserve"> (Optional)</w:t>
       </w:r>
-      <w:bookmarkEnd w:id="44"/>
+      <w:bookmarkEnd w:id="43"/>
     </w:p>
     <w:p>
       <w:pPr>
@@ -13037,15 +12901,7 @@
         <w:pStyle w:val="textbody"/>
       </w:pPr>
       <w:r>
-        <w:t>This parameter specifies a raster map to represent where and how accidental fires are suppressed.  The map units are integers and should only include</w:t>
-      </w:r>
-      <w:proofErr w:type="gramStart"/>
-      <w:r>
-        <w:t>:  0</w:t>
-      </w:r>
-      <w:proofErr w:type="gramEnd"/>
-      <w:r>
-        <w:t>, 1, 2, 3, indicating no suppression, light, moderate, and maximal suppression</w:t>
+        <w:t>This parameter specifies a raster map to represent where and how accidental fires are suppressed.  The map units are integers and should only include:  0, 1, 2, 3, indicating no suppression, light, moderate, and maximal suppression</w:t>
       </w:r>
       <w:r>
         <w:t xml:space="preserve"> </w:t>
@@ -13086,15 +12942,7 @@
         <w:pStyle w:val="textbody"/>
       </w:pPr>
       <w:r>
-        <w:t>This parameter specifies a raster map to represent where and how lightning fires are suppressed.  The map units are integers and should only include</w:t>
-      </w:r>
-      <w:proofErr w:type="gramStart"/>
-      <w:r>
-        <w:t>:  0</w:t>
-      </w:r>
-      <w:proofErr w:type="gramEnd"/>
-      <w:r>
-        <w:t>, 1, 2, 3, indicating no suppression, light, moderate, and maximal suppression</w:t>
+        <w:t>This parameter specifies a raster map to represent where and how lightning fires are suppressed.  The map units are integers and should only include:  0, 1, 2, 3, indicating no suppression, light, moderate, and maximal suppression</w:t>
       </w:r>
       <w:r>
         <w:t xml:space="preserve"> </w:t>
@@ -13138,15 +12986,7 @@
         <w:pStyle w:val="textbody"/>
       </w:pPr>
       <w:r>
-        <w:t>This parameter specifies a raster map to represent where and how prescribed fires are suppressed.  The map units are integers and should only include</w:t>
-      </w:r>
-      <w:proofErr w:type="gramStart"/>
-      <w:r>
-        <w:t>:  0</w:t>
-      </w:r>
-      <w:proofErr w:type="gramEnd"/>
-      <w:r>
-        <w:t>, 1, 2, 3, indicating no suppression, light, moderate, and maximal suppression</w:t>
+        <w:t>This parameter specifies a raster map to represent where and how prescribed fires are suppressed.  The map units are integers and should only include:  0, 1, 2, 3, indicating no suppression, light, moderate, and maximal suppression</w:t>
       </w:r>
       <w:r>
         <w:t xml:space="preserve"> </w:t>
@@ -13174,8 +13014,8 @@
         <w:pStyle w:val="Heading2"/>
         <w:spacing w:after="120"/>
       </w:pPr>
-      <w:bookmarkStart w:id="50" w:name="_Ref272935732"/>
-      <w:bookmarkStart w:id="51" w:name="_Toc233896146"/>
+      <w:bookmarkStart w:id="50" w:name="_Toc233896146"/>
+      <w:bookmarkStart w:id="51" w:name="_Ref272935732"/>
       <w:proofErr w:type="spellStart"/>
       <w:r>
         <w:t>DynamicAccidentalSuppressionMaps</w:t>
@@ -13184,7 +13024,7 @@
       <w:r>
         <w:t xml:space="preserve"> (Optional)</w:t>
       </w:r>
-      <w:bookmarkEnd w:id="51"/>
+      <w:bookmarkEnd w:id="50"/>
     </w:p>
     <w:p>
       <w:pPr>
@@ -13409,7 +13249,7 @@
       <w:r>
         <w:t xml:space="preserve"> </w:t>
       </w:r>
-      <w:bookmarkEnd w:id="50"/>
+      <w:bookmarkEnd w:id="51"/>
     </w:p>
     <w:p>
       <w:pPr>
@@ -13479,15 +13319,7 @@
         <w:pStyle w:val="textbody"/>
       </w:pPr>
       <w:r>
-        <w:t xml:space="preserve">This parameter specifies a raster map to represent the percent clay. Values in this map should range </w:t>
-      </w:r>
-      <w:proofErr w:type="gramStart"/>
-      <w:r>
-        <w:t>for</w:t>
-      </w:r>
-      <w:proofErr w:type="gramEnd"/>
-      <w:r>
-        <w:t xml:space="preserve"> 0 to 1. </w:t>
+        <w:t xml:space="preserve">This parameter specifies a raster map to represent the percent clay. Values in this map should range for 0 to 1. </w:t>
       </w:r>
       <w:r>
         <w:t xml:space="preserve">  </w:t>
@@ -13515,15 +13347,7 @@
         <w:t>2019</w:t>
       </w:r>
       <w:r>
-        <w:t xml:space="preserve">).  This value is empirically derived </w:t>
-      </w:r>
-      <w:proofErr w:type="gramStart"/>
-      <w:r>
-        <w:t>for</w:t>
-      </w:r>
-      <w:proofErr w:type="gramEnd"/>
-      <w:r>
-        <w:t xml:space="preserve"> lightning ignitions.</w:t>
+        <w:t>).  This value is empirically derived for lightning ignitions.</w:t>
       </w:r>
     </w:p>
     <w:p>
@@ -13548,15 +13372,7 @@
         <w:t>2019</w:t>
       </w:r>
       <w:r>
-        <w:t xml:space="preserve">).  This value is empirically derived </w:t>
-      </w:r>
-      <w:proofErr w:type="gramStart"/>
-      <w:r>
-        <w:t>for</w:t>
-      </w:r>
-      <w:proofErr w:type="gramEnd"/>
-      <w:r>
-        <w:t xml:space="preserve"> lightning ignitions.</w:t>
+        <w:t>).  This value is empirically derived for lightning ignitions.</w:t>
       </w:r>
     </w:p>
     <w:p>
@@ -13581,15 +13397,7 @@
         <w:t>2019</w:t>
       </w:r>
       <w:r>
-        <w:t xml:space="preserve">).  This value is empirically derived </w:t>
-      </w:r>
-      <w:proofErr w:type="gramStart"/>
-      <w:r>
-        <w:t>for</w:t>
-      </w:r>
-      <w:proofErr w:type="gramEnd"/>
-      <w:r>
-        <w:t xml:space="preserve"> accidental ignitions.</w:t>
+        <w:t>).  This value is empirically derived for accidental ignitions.</w:t>
       </w:r>
     </w:p>
     <w:p>
@@ -13614,15 +13422,7 @@
         <w:t>2019</w:t>
       </w:r>
       <w:r>
-        <w:t xml:space="preserve">).  This value is empirically derived </w:t>
-      </w:r>
-      <w:proofErr w:type="gramStart"/>
-      <w:r>
-        <w:t>for</w:t>
-      </w:r>
-      <w:proofErr w:type="gramEnd"/>
-      <w:r>
-        <w:t xml:space="preserve"> accidental ignitions.</w:t>
+        <w:t>).  This value is empirically derived for accidental ignitions.</w:t>
       </w:r>
     </w:p>
     <w:p>
@@ -13642,15 +13442,7 @@
         <w:pStyle w:val="textbody"/>
       </w:pPr>
       <w:r>
-        <w:t xml:space="preserve">This parameter indicates to the model which ignition sub-model you are using </w:t>
-      </w:r>
-      <w:proofErr w:type="gramStart"/>
-      <w:r>
-        <w:t>either,</w:t>
-      </w:r>
-      <w:proofErr w:type="gramEnd"/>
-      <w:r>
-        <w:t xml:space="preserve"> </w:t>
+        <w:t xml:space="preserve">This parameter indicates to the model which ignition sub-model you are using either, </w:t>
       </w:r>
       <w:proofErr w:type="spellStart"/>
       <w:r>
@@ -13685,15 +13477,7 @@
         <w:t>z0</w:t>
       </w:r>
       <w:r>
-        <w:t xml:space="preserve"> parameter from equation 2. This value is empirically derived </w:t>
-      </w:r>
-      <w:proofErr w:type="gramStart"/>
-      <w:r>
-        <w:t>for</w:t>
-      </w:r>
-      <w:proofErr w:type="gramEnd"/>
-      <w:r>
-        <w:t xml:space="preserve"> lightning ignitions.</w:t>
+        <w:t xml:space="preserve"> parameter from equation 2. This value is empirically derived for lightning ignitions.</w:t>
       </w:r>
     </w:p>
     <w:p>
@@ -13720,15 +13504,7 @@
         <w:t>z1</w:t>
       </w:r>
       <w:r>
-        <w:t xml:space="preserve"> parameter from equation 2. This value is empirically derived </w:t>
-      </w:r>
-      <w:proofErr w:type="gramStart"/>
-      <w:r>
-        <w:t>for</w:t>
-      </w:r>
-      <w:proofErr w:type="gramEnd"/>
-      <w:r>
-        <w:t xml:space="preserve"> lightning ignitions.</w:t>
+        <w:t xml:space="preserve"> parameter from equation 2. This value is empirically derived for lightning ignitions.</w:t>
       </w:r>
     </w:p>
     <w:p>
@@ -13755,15 +13531,7 @@
         <w:t>z0</w:t>
       </w:r>
       <w:r>
-        <w:t xml:space="preserve"> parameter from equation 2. This value is empirically derived </w:t>
-      </w:r>
-      <w:proofErr w:type="gramStart"/>
-      <w:r>
-        <w:t>for</w:t>
-      </w:r>
-      <w:proofErr w:type="gramEnd"/>
-      <w:r>
-        <w:t xml:space="preserve"> accidental ignitions.</w:t>
+        <w:t xml:space="preserve"> parameter from equation 2. This value is empirically derived for accidental ignitions.</w:t>
       </w:r>
     </w:p>
     <w:p>
@@ -13790,15 +13558,7 @@
         <w:t>z1</w:t>
       </w:r>
       <w:r>
-        <w:t xml:space="preserve"> parameter from equation 2. This value is empirically derived </w:t>
-      </w:r>
-      <w:proofErr w:type="gramStart"/>
-      <w:r>
-        <w:t>for</w:t>
-      </w:r>
-      <w:proofErr w:type="gramEnd"/>
-      <w:r>
-        <w:t xml:space="preserve"> accidental ignitions.</w:t>
+        <w:t xml:space="preserve"> parameter from equation 2. This value is empirically derived for accidental ignitions.</w:t>
       </w:r>
     </w:p>
     <w:p>
@@ -13820,15 +13580,7 @@
         <w:pStyle w:val="textbody"/>
       </w:pPr>
       <w:r>
-        <w:t xml:space="preserve">This is the maximum </w:t>
-      </w:r>
-      <w:proofErr w:type="gramStart"/>
-      <w:r>
-        <w:t>amount</w:t>
-      </w:r>
-      <w:proofErr w:type="gramEnd"/>
-      <w:r>
-        <w:t xml:space="preserve"> of fine fuels (g m</w:t>
+        <w:t>This is the maximum amount of fine fuels (g m</w:t>
       </w:r>
       <w:r>
         <w:rPr>
@@ -13888,15 +13640,7 @@
         <w:t xml:space="preserve">is often </w:t>
       </w:r>
       <w:r>
-        <w:t xml:space="preserve">estimated </w:t>
-      </w:r>
-      <w:proofErr w:type="gramStart"/>
-      <w:r>
-        <w:t>from</w:t>
-      </w:r>
-      <w:proofErr w:type="gramEnd"/>
-      <w:r>
-        <w:t xml:space="preserve"> </w:t>
+        <w:t xml:space="preserve">estimated from </w:t>
       </w:r>
       <w:r>
         <w:t xml:space="preserve">landscape average fine fuels excluding any recent </w:t>
@@ -13983,15 +13727,7 @@
         <w:pStyle w:val="textbody"/>
       </w:pPr>
       <w:r>
-        <w:t xml:space="preserve">The minimum Fire Weather Index under which prescribed fires will be put on the landscape.  </w:t>
-      </w:r>
-      <w:proofErr w:type="gramStart"/>
-      <w:r>
-        <w:t>Typically</w:t>
-      </w:r>
-      <w:proofErr w:type="gramEnd"/>
-      <w:r>
-        <w:t xml:space="preserve"> prescribed fires will </w:t>
+        <w:t xml:space="preserve">The minimum Fire Weather Index under which prescribed fires will be put on the landscape.  Typically prescribed fires will </w:t>
       </w:r>
       <w:r>
         <w:rPr>
@@ -14009,9 +13745,9 @@
         <w:spacing w:after="120"/>
       </w:pPr>
       <w:bookmarkStart w:id="69" w:name="EcoTable"/>
-      <w:bookmarkStart w:id="70" w:name="_Toc136162638"/>
-      <w:bookmarkStart w:id="71" w:name="_Toc233896163"/>
-      <w:bookmarkEnd w:id="43"/>
+      <w:bookmarkStart w:id="70" w:name="_Toc233896163"/>
+      <w:bookmarkStart w:id="71" w:name="_Toc136162638"/>
+      <w:bookmarkEnd w:id="44"/>
       <w:bookmarkEnd w:id="69"/>
       <w:proofErr w:type="spellStart"/>
       <w:r>
@@ -14021,22 +13757,14 @@
       <w:r>
         <w:t xml:space="preserve"> (Optional)</w:t>
       </w:r>
-      <w:bookmarkEnd w:id="71"/>
+      <w:bookmarkEnd w:id="70"/>
     </w:p>
     <w:p>
       <w:pPr>
         <w:pStyle w:val="textbody"/>
       </w:pPr>
       <w:r>
-        <w:t xml:space="preserve">The maximum temperature (Celsius) under which prescribed fires </w:t>
-      </w:r>
-      <w:proofErr w:type="gramStart"/>
-      <w:r>
-        <w:t>will occur</w:t>
-      </w:r>
-      <w:proofErr w:type="gramEnd"/>
-      <w:r>
-        <w:t>.</w:t>
+        <w:t>The maximum temperature (Celsius) under which prescribed fires will occur.</w:t>
       </w:r>
     </w:p>
     <w:p>
@@ -14112,13 +13840,8 @@
         </w:rPr>
         <w:t>Note</w:t>
       </w:r>
-      <w:proofErr w:type="gramStart"/>
-      <w:r>
-        <w:t>:  Although</w:t>
-      </w:r>
-      <w:proofErr w:type="gramEnd"/>
-      <w:r>
-        <w:t xml:space="preserve"> the meaning has changed to fire severity, the keyword remains the same.</w:t>
+      <w:r>
+        <w:t>:  Although the meaning has changed to fire severity, the keyword remains the same.</w:t>
       </w:r>
     </w:p>
     <w:p>
@@ -14182,15 +13905,7 @@
         <w:pStyle w:val="textbody"/>
       </w:pPr>
       <w:r>
-        <w:t xml:space="preserve">The first Julian day </w:t>
-      </w:r>
-      <w:proofErr w:type="gramStart"/>
-      <w:r>
-        <w:t>in</w:t>
-      </w:r>
-      <w:proofErr w:type="gramEnd"/>
-      <w:r>
-        <w:t xml:space="preserve"> which a prescribed fire can begin.  This is important if fall burning is preferred over spring burning.</w:t>
+        <w:t>The first Julian day in which a prescribed fire can begin.  This is important if fall burning is preferred over spring burning.</w:t>
       </w:r>
     </w:p>
     <w:p>
@@ -14211,15 +13926,7 @@
         <w:pStyle w:val="textbody"/>
       </w:pPr>
       <w:r>
-        <w:t xml:space="preserve">The last Julian day </w:t>
-      </w:r>
-      <w:proofErr w:type="gramStart"/>
-      <w:r>
-        <w:t>in</w:t>
-      </w:r>
-      <w:proofErr w:type="gramEnd"/>
-      <w:r>
-        <w:t xml:space="preserve"> which a prescribed fire can begin.  </w:t>
+        <w:t xml:space="preserve">The last Julian day in which a prescribed fire can begin.  </w:t>
       </w:r>
     </w:p>
     <w:p>
@@ -14240,15 +13947,7 @@
         <w:pStyle w:val="textbody"/>
       </w:pPr>
       <w:r>
-        <w:t xml:space="preserve">The maximum size for a prescribed fire </w:t>
-      </w:r>
-      <w:proofErr w:type="gramStart"/>
-      <w:r>
-        <w:t>in</w:t>
-      </w:r>
-      <w:proofErr w:type="gramEnd"/>
-      <w:r>
-        <w:t xml:space="preserve"> hectares.</w:t>
+        <w:t>The maximum size for a prescribed fire in hectares.</w:t>
       </w:r>
     </w:p>
     <w:p>
@@ -14462,15 +14161,7 @@
         <w:pStyle w:val="textbody"/>
       </w:pPr>
       <w:r>
-        <w:t>Note</w:t>
-      </w:r>
-      <w:proofErr w:type="gramStart"/>
-      <w:r>
-        <w:t>:  The</w:t>
-      </w:r>
-      <w:proofErr w:type="gramEnd"/>
-      <w:r>
-        <w:t xml:space="preserve"> climate library converts all wind speed units into </w:t>
+        <w:t xml:space="preserve">Note:  The climate library converts all wind speed units into </w:t>
       </w:r>
       <w:r>
         <w:rPr>
@@ -14794,15 +14485,7 @@
         <w:pStyle w:val="textbody"/>
       </w:pPr>
       <w:r>
-        <w:t>Note</w:t>
-      </w:r>
-      <w:proofErr w:type="gramStart"/>
-      <w:r>
-        <w:t>:  The</w:t>
-      </w:r>
-      <w:proofErr w:type="gramEnd"/>
-      <w:r>
-        <w:t xml:space="preserve"> climate library converts all wind speed units into </w:t>
+        <w:t xml:space="preserve">Note:  The climate library converts all wind speed units into </w:t>
       </w:r>
       <w:r>
         <w:rPr>
@@ -14938,13 +14621,13 @@
         </w:numPr>
         <w:spacing w:after="120"/>
       </w:pPr>
-      <w:bookmarkStart w:id="98" w:name="_Toc48384081"/>
-      <w:bookmarkStart w:id="99" w:name="_Toc233896190"/>
+      <w:bookmarkStart w:id="98" w:name="_Toc233896190"/>
+      <w:bookmarkStart w:id="99" w:name="_Toc48384081"/>
       <w:proofErr w:type="spellStart"/>
       <w:r>
         <w:t>LadderFuelMaxAge</w:t>
       </w:r>
-      <w:bookmarkEnd w:id="99"/>
+      <w:bookmarkEnd w:id="98"/>
       <w:proofErr w:type="spellEnd"/>
     </w:p>
     <w:p>
@@ -14991,7 +14674,7 @@
       <w:r>
         <w:t>LadderFuelSpeciesList</w:t>
       </w:r>
-      <w:bookmarkEnd w:id="98"/>
+      <w:bookmarkEnd w:id="99"/>
       <w:bookmarkEnd w:id="100"/>
       <w:proofErr w:type="spellEnd"/>
     </w:p>
@@ -15000,15 +14683,7 @@
         <w:pStyle w:val="textbody"/>
       </w:pPr>
       <w:r>
-        <w:t xml:space="preserve">A list of species codes for species that are considered ladder fuels.  Conifers are typically considered ladder </w:t>
-      </w:r>
-      <w:proofErr w:type="gramStart"/>
-      <w:r>
-        <w:t>fuels</w:t>
-      </w:r>
-      <w:proofErr w:type="gramEnd"/>
-      <w:r>
-        <w:t xml:space="preserve"> but rhododendrons and other shrubs may also act as ladder fuels.</w:t>
+        <w:t>A list of species codes for species that are considered ladder fuels.  Conifers are typically considered ladder fuels but rhododendrons and other shrubs may also act as ladder fuels.</w:t>
       </w:r>
     </w:p>
     <w:p>
@@ -15078,13 +14753,8 @@
         <w:t>IgnitionType</w:t>
       </w:r>
       <w:proofErr w:type="spellEnd"/>
-      <w:proofErr w:type="gramStart"/>
-      <w:r>
-        <w:t>:  Accidental</w:t>
-      </w:r>
-      <w:proofErr w:type="gramEnd"/>
-      <w:r>
-        <w:t>, Lightning, or Rx (text input)</w:t>
+      <w:r>
+        <w:t>:  Accidental, Lightning, or Rx (text input)</w:t>
       </w:r>
     </w:p>
     <w:p>
@@ -15096,13 +14766,8 @@
         <w:t>Mapcode</w:t>
       </w:r>
       <w:proofErr w:type="spellEnd"/>
-      <w:proofErr w:type="gramStart"/>
-      <w:r>
-        <w:t>:  The</w:t>
-      </w:r>
-      <w:proofErr w:type="gramEnd"/>
-      <w:r>
-        <w:t xml:space="preserve"> map code in the corresponding suppression map (integer)</w:t>
+      <w:r>
+        <w:t>:  The map code in the corresponding suppression map (integer)</w:t>
       </w:r>
     </w:p>
     <w:p>
@@ -15110,15 +14775,7 @@
         <w:pStyle w:val="textbody"/>
       </w:pPr>
       <w:r>
-        <w:t xml:space="preserve">Suppress_Category_0:  </w:t>
-      </w:r>
-      <w:proofErr w:type="gramStart"/>
-      <w:r>
-        <w:t>The  suppression</w:t>
-      </w:r>
-      <w:proofErr w:type="gramEnd"/>
-      <w:r>
-        <w:t xml:space="preserve"> effort, given a FWI &lt; FWI_Break_1</w:t>
+        <w:t>Suppress_Category_0:  The  suppression effort, given a FWI &lt; FWI_Break_1</w:t>
       </w:r>
       <w:r>
         <w:t xml:space="preserve"> (integer). Suppression effort defines how much the probability of spread is reduced by suppression, e.g., 5%, 65%, 95%, and reflects the resources that would be committed to suppression under low fire risk, moderate fire risk, and high fire risk (as defined by the two FWI break points). </w:t>
@@ -15132,15 +14789,7 @@
         <w:pStyle w:val="textbody"/>
       </w:pPr>
       <w:r>
-        <w:t>FWI_Break_1</w:t>
-      </w:r>
-      <w:proofErr w:type="gramStart"/>
-      <w:r>
-        <w:t>:  The</w:t>
-      </w:r>
-      <w:proofErr w:type="gramEnd"/>
-      <w:r>
-        <w:t xml:space="preserve"> daily FWI that defines the highest FWI for suppression category 0 (integer)</w:t>
+        <w:t>FWI_Break_1:  The daily FWI that defines the highest FWI for suppression category 0 (integer)</w:t>
       </w:r>
     </w:p>
     <w:p>
@@ -15148,16 +14797,11 @@
         <w:pStyle w:val="textbody"/>
       </w:pPr>
       <w:r>
-        <w:t>Suppress_Category_1</w:t>
-      </w:r>
-      <w:proofErr w:type="gramStart"/>
-      <w:r>
-        <w:t xml:space="preserve">:  </w:t>
+        <w:t xml:space="preserve">Suppress_Category_1:  </w:t>
       </w:r>
       <w:r>
         <w:t>The</w:t>
       </w:r>
-      <w:proofErr w:type="gramEnd"/>
       <w:r>
         <w:t xml:space="preserve"> </w:t>
       </w:r>
@@ -15170,15 +14814,7 @@
         <w:pStyle w:val="textbody"/>
       </w:pPr>
       <w:r>
-        <w:t>FWI_Break_2</w:t>
-      </w:r>
-      <w:proofErr w:type="gramStart"/>
-      <w:r>
-        <w:t>:  The</w:t>
-      </w:r>
-      <w:proofErr w:type="gramEnd"/>
-      <w:r>
-        <w:t xml:space="preserve"> daily FWI that defines the highest FWI for suppression category 1 (integer)</w:t>
+        <w:t>FWI_Break_2:  The daily FWI that defines the highest FWI for suppression category 1 (integer)</w:t>
       </w:r>
     </w:p>
     <w:p>
@@ -15186,15 +14822,7 @@
         <w:pStyle w:val="textbody"/>
       </w:pPr>
       <w:r>
-        <w:t>Suppress_Category_2</w:t>
-      </w:r>
-      <w:proofErr w:type="gramStart"/>
-      <w:r>
-        <w:t>:  The</w:t>
-      </w:r>
-      <w:proofErr w:type="gramEnd"/>
-      <w:r>
-        <w:t xml:space="preserve"> suppression effort, given a FWI &gt; FWI_Break_2 (integer)</w:t>
+        <w:t>Suppress_Category_2:  The suppression effort, given a FWI &gt; FWI_Break_2 (integer)</w:t>
       </w:r>
     </w:p>
     <w:p>
@@ -17160,7 +16788,7 @@
       <w:bookmarkStart w:id="105" w:name="_Toc102232960"/>
       <w:bookmarkStart w:id="106" w:name="_Toc136162695"/>
       <w:bookmarkStart w:id="107" w:name="_Toc233896195"/>
-      <w:bookmarkEnd w:id="70"/>
+      <w:bookmarkEnd w:id="71"/>
       <w:r>
         <w:lastRenderedPageBreak/>
         <w:t>Output Files</w:t>
@@ -17171,7 +16799,10 @@
     </w:p>
     <w:p>
       <w:r>
-        <w:t xml:space="preserve">The extension outputs were designed to </w:t>
+        <w:t xml:space="preserve">SCF </w:t>
+      </w:r>
+      <w:r>
+        <w:t xml:space="preserve">outputs were designed to </w:t>
       </w:r>
       <w:r>
         <w:t xml:space="preserve">assist with model calibration, </w:t>
@@ -17183,7 +16814,7 @@
         <w:t xml:space="preserve">, and to </w:t>
       </w:r>
       <w:r>
-        <w:t xml:space="preserve">analyze fire behavior in the simulation. </w:t>
+        <w:t xml:space="preserve">analyze fire behavior. </w:t>
       </w:r>
       <w:r>
         <w:t xml:space="preserve"> Full metadata for all outputs is available in the Metadata/</w:t>
@@ -17200,52 +16831,28 @@
         <w:pStyle w:val="Heading2"/>
         <w:spacing w:after="120"/>
       </w:pPr>
-      <w:bookmarkStart w:id="108" w:name="_Toc102232961"/>
-      <w:bookmarkStart w:id="109" w:name="_Ref133900246"/>
-      <w:bookmarkStart w:id="110" w:name="_Toc136162696"/>
-      <w:bookmarkStart w:id="111" w:name="_Ref272935798"/>
-      <w:bookmarkStart w:id="112" w:name="_Toc233896196"/>
+      <w:bookmarkStart w:id="108" w:name="_Toc233896196"/>
+      <w:bookmarkStart w:id="109" w:name="_Toc102232961"/>
+      <w:bookmarkStart w:id="110" w:name="_Ref133900246"/>
+      <w:bookmarkStart w:id="111" w:name="_Toc136162696"/>
+      <w:bookmarkStart w:id="112" w:name="_Ref272935798"/>
       <w:r>
         <w:t>Day of Fire Map</w:t>
       </w:r>
       <w:r>
         <w:t>s</w:t>
       </w:r>
-      <w:bookmarkEnd w:id="112"/>
+      <w:bookmarkEnd w:id="108"/>
     </w:p>
     <w:p>
       <w:pPr>
         <w:pStyle w:val="textbody"/>
       </w:pPr>
       <w:r>
-        <w:t xml:space="preserve">The map of ‘fire </w:t>
-      </w:r>
-      <w:proofErr w:type="gramStart"/>
-      <w:r>
-        <w:t>days’</w:t>
-      </w:r>
-      <w:proofErr w:type="gramEnd"/>
-      <w:r>
-        <w:t xml:space="preserve"> tracks on which day of the year a cell </w:t>
-      </w:r>
-      <w:proofErr w:type="gramStart"/>
-      <w:r>
-        <w:t>burned</w:t>
-      </w:r>
-      <w:proofErr w:type="gramEnd"/>
-      <w:r>
-        <w:t>. Map values equal Julian day of time step.</w:t>
-      </w:r>
-      <w:r>
-        <w:t xml:space="preserve">  Note</w:t>
-      </w:r>
-      <w:proofErr w:type="gramStart"/>
-      <w:r>
-        <w:t>:  map</w:t>
-      </w:r>
-      <w:proofErr w:type="gramEnd"/>
-      <w:r>
-        <w:t xml:space="preserve"> values = 0 indicates an inactive site; 1 = active but unburned; &gt; 1 = Day-of-year for the fire + 1.</w:t>
+        <w:t>The map of ‘fire days’ tracks on which day of the year a cell burned. Map values equal Julian day of time step.</w:t>
+      </w:r>
+      <w:r>
+        <w:t xml:space="preserve">  Note:  map values = 0 indicates an inactive site; 1 = active but unburned; &gt; 1 = Day-of-year for the fire + 1.</w:t>
       </w:r>
     </w:p>
     <w:p>
@@ -17263,13 +16870,13 @@
       <w:r>
         <w:t>Map</w:t>
       </w:r>
-      <w:bookmarkEnd w:id="108"/>
       <w:bookmarkEnd w:id="109"/>
+      <w:bookmarkEnd w:id="110"/>
       <w:r>
         <w:t>s</w:t>
       </w:r>
-      <w:bookmarkEnd w:id="110"/>
       <w:bookmarkEnd w:id="111"/>
+      <w:bookmarkEnd w:id="112"/>
       <w:bookmarkEnd w:id="113"/>
     </w:p>
     <w:p>
@@ -17297,13 +16904,8 @@
       <w:r>
         <w:t xml:space="preserve"> Map values: 0 = </w:t>
       </w:r>
-      <w:proofErr w:type="gramStart"/>
-      <w:r>
-        <w:t>Non-active</w:t>
-      </w:r>
-      <w:proofErr w:type="gramEnd"/>
-      <w:r>
-        <w:t>; 1=</w:t>
+      <w:r>
+        <w:t>Non-active; 1=</w:t>
       </w:r>
       <w:r>
         <w:t>Unburned site</w:t>
@@ -17332,14 +16934,14 @@
         <w:pStyle w:val="Heading2"/>
         <w:spacing w:after="120"/>
       </w:pPr>
-      <w:bookmarkStart w:id="114" w:name="_Ref133900608"/>
-      <w:bookmarkStart w:id="115" w:name="_Toc136162697"/>
-      <w:bookmarkStart w:id="116" w:name="_Toc102232962"/>
-      <w:bookmarkStart w:id="117" w:name="_Toc233896198"/>
+      <w:bookmarkStart w:id="114" w:name="_Toc233896198"/>
+      <w:bookmarkStart w:id="115" w:name="_Ref133900608"/>
+      <w:bookmarkStart w:id="116" w:name="_Toc136162697"/>
+      <w:bookmarkStart w:id="117" w:name="_Toc102232962"/>
       <w:r>
         <w:t>Fire Spread Probability Maps</w:t>
       </w:r>
-      <w:bookmarkEnd w:id="117"/>
+      <w:bookmarkEnd w:id="114"/>
     </w:p>
     <w:p>
       <w:pPr>
@@ -17485,22 +17087,15 @@
       </w:pPr>
       <w:bookmarkStart w:id="121" w:name="_Toc233896202"/>
       <w:r>
-        <w:t>Fire Ignition Log</w:t>
-      </w:r>
-      <w:bookmarkEnd w:id="121"/>
+        <w:t>Biomass Mortality Maps</w:t>
+      </w:r>
     </w:p>
     <w:p>
       <w:pPr>
         <w:pStyle w:val="textbody"/>
       </w:pPr>
       <w:r>
-        <w:t>The Fire ignition table is designed to capture the relationship between attempted FWI and number of fire ignitions for each type, for each day and year.</w:t>
-      </w:r>
-      <w:r>
-        <w:t xml:space="preserve"> </w:t>
-      </w:r>
-      <w:r>
-        <w:t>This log file tracks the number of ignitions and the climatic conditions under which they occurred: year, Julian day of year, number of attempted ignitions, Fire Weather Index, and type of ignition</w:t>
+        <w:t>Raster files of the biomass (g m-2) killed each year by all types of fire.</w:t>
       </w:r>
     </w:p>
     <w:p>
@@ -17508,14 +17103,156 @@
         <w:pStyle w:val="Heading2"/>
         <w:spacing w:after="120"/>
       </w:pPr>
+      <w:r>
+        <w:t>Fire DNBR Maps</w:t>
+      </w:r>
+    </w:p>
+    <w:p>
+      <w:pPr>
+        <w:pStyle w:val="textbody"/>
+      </w:pPr>
+      <w:r>
+        <w:t xml:space="preserve">Raster files of the </w:t>
+      </w:r>
+      <w:proofErr w:type="spellStart"/>
+      <w:r>
+        <w:t>dNBR</w:t>
+      </w:r>
+      <w:proofErr w:type="spellEnd"/>
+      <w:r>
+        <w:t xml:space="preserve"> (</w:t>
+      </w:r>
+      <w:r>
+        <w:t>differenced Normalized Burn Ratio</w:t>
+      </w:r>
+      <w:r>
+        <w:t>), which SCF uses as a site level indicator of fire severity.  Integers range from 0 – 1000.</w:t>
+      </w:r>
+    </w:p>
+    <w:p>
+      <w:pPr>
+        <w:pStyle w:val="Heading2"/>
+        <w:spacing w:after="120"/>
+      </w:pPr>
+      <w:r>
+        <w:lastRenderedPageBreak/>
+        <w:t>Flaming Consumption Maps</w:t>
+      </w:r>
+    </w:p>
+    <w:p>
+      <w:pPr>
+        <w:pStyle w:val="textbody"/>
+      </w:pPr>
+      <w:r>
+        <w:t>Raster maps of biomass (g m-2) lost from SMALL wood (35% of the woody component killed by fire).</w:t>
+      </w:r>
+    </w:p>
+    <w:p>
+      <w:pPr>
+        <w:pStyle w:val="Heading2"/>
+        <w:spacing w:after="120"/>
+      </w:pPr>
+      <w:r>
+        <w:t>Smoldering Consumption Maps</w:t>
+      </w:r>
+    </w:p>
+    <w:p>
+      <w:pPr>
+        <w:pStyle w:val="textbody"/>
+      </w:pPr>
+      <w:r>
+        <w:t xml:space="preserve">Raster maps of biomass (g m-2) lost from </w:t>
+      </w:r>
+      <w:r>
+        <w:t xml:space="preserve">LARGE </w:t>
+      </w:r>
+      <w:r>
+        <w:t>wood (</w:t>
+      </w:r>
+      <w:r>
+        <w:t>6</w:t>
+      </w:r>
+      <w:r>
+        <w:t>5% of the woody component killed by fire)</w:t>
+      </w:r>
+    </w:p>
+    <w:p>
+      <w:pPr>
+        <w:pStyle w:val="Heading2"/>
+        <w:spacing w:after="120"/>
+      </w:pPr>
+      <w:r>
+        <w:t>Fine Fuel Maps</w:t>
+      </w:r>
+    </w:p>
+    <w:p>
+      <w:pPr>
+        <w:pStyle w:val="textbody"/>
+      </w:pPr>
+      <w:r>
+        <w:t xml:space="preserve">Raster maps of the fine fuels (g m-2) </w:t>
+      </w:r>
+      <w:r>
+        <w:t xml:space="preserve">that feed into spread and severity equations.  The meaning of fine fuels will vary depending on the succession used.  </w:t>
+      </w:r>
+    </w:p>
+    <w:p>
+      <w:pPr>
+        <w:pStyle w:val="Heading2"/>
+        <w:spacing w:after="120"/>
+      </w:pPr>
+      <w:r>
+        <w:t>Fire Ignition Log</w:t>
+      </w:r>
+      <w:bookmarkEnd w:id="121"/>
+      <w:r>
+        <w:t xml:space="preserve"> (CSV)</w:t>
+      </w:r>
+    </w:p>
+    <w:p>
+      <w:pPr>
+        <w:pStyle w:val="textbody"/>
+      </w:pPr>
+      <w:r>
+        <w:t xml:space="preserve">The Fire ignition </w:t>
+      </w:r>
+      <w:r>
+        <w:t xml:space="preserve">log file </w:t>
+      </w:r>
+      <w:r>
+        <w:t>capture</w:t>
+      </w:r>
+      <w:r>
+        <w:t>s</w:t>
+      </w:r>
+      <w:r>
+        <w:t xml:space="preserve"> the relationship between attempted FWI and number of fire ignitions for each type, for each day and year.</w:t>
+      </w:r>
+      <w:r>
+        <w:t xml:space="preserve"> </w:t>
+      </w:r>
+      <w:r>
+        <w:t xml:space="preserve">It </w:t>
+      </w:r>
+      <w:r>
+        <w:t>tracks the number of ignitions and the climatic conditions under which they occurred: year, Julian day of year, number of attempted ignitions, Fire Weather Index, and type of ignition</w:t>
+      </w:r>
+    </w:p>
+    <w:p>
+      <w:pPr>
+        <w:pStyle w:val="Heading2"/>
+        <w:spacing w:after="120"/>
+      </w:pPr>
       <w:bookmarkStart w:id="122" w:name="_Toc233896203"/>
       <w:r>
-        <w:lastRenderedPageBreak/>
         <w:t>Fire Event Log</w:t>
       </w:r>
-      <w:bookmarkEnd w:id="114"/>
       <w:bookmarkEnd w:id="115"/>
+      <w:bookmarkEnd w:id="116"/>
       <w:bookmarkEnd w:id="122"/>
+      <w:r>
+        <w:t xml:space="preserve"> (CSV)</w:t>
+      </w:r>
     </w:p>
     <w:p>
       <w:pPr>
@@ -17763,19 +17500,6 @@
     </w:p>
     <w:p>
       <w:pPr>
-        <w:pStyle w:val="textbody"/>
-      </w:pPr>
-    </w:p>
-    <w:p>
-      <w:pPr>
-        <w:pStyle w:val="textbody"/>
-      </w:pPr>
-      <w:r>
-        <w:t>The information is stored as comma-separated values (CSV).</w:t>
-      </w:r>
-    </w:p>
-    <w:p>
-      <w:pPr>
         <w:pStyle w:val="Heading2"/>
         <w:spacing w:after="120"/>
       </w:pPr>
@@ -17783,6 +17507,7 @@
       <w:bookmarkStart w:id="124" w:name="_Toc136162698"/>
       <w:bookmarkStart w:id="125" w:name="_Toc233896204"/>
       <w:r>
+        <w:lastRenderedPageBreak/>
         <w:t xml:space="preserve">Fire </w:t>
       </w:r>
       <w:r>
@@ -17791,10 +17516,13 @@
       <w:r>
         <w:t xml:space="preserve"> Log</w:t>
       </w:r>
-      <w:bookmarkEnd w:id="116"/>
+      <w:bookmarkEnd w:id="117"/>
       <w:bookmarkEnd w:id="123"/>
       <w:bookmarkEnd w:id="124"/>
       <w:bookmarkEnd w:id="125"/>
+      <w:r>
+        <w:t xml:space="preserve"> (CSV)</w:t>
+      </w:r>
     </w:p>
     <w:p>
       <w:pPr>
@@ -17897,15 +17625,7 @@
         <w:spacing w:after="0"/>
       </w:pPr>
       <w:r>
-        <w:t xml:space="preserve">number of </w:t>
-      </w:r>
-      <w:proofErr w:type="gramStart"/>
-      <w:r>
-        <w:t>lighting</w:t>
-      </w:r>
-      <w:proofErr w:type="gramEnd"/>
-      <w:r>
-        <w:t xml:space="preserve"> ignited fires</w:t>
+        <w:t>number of lighting ignited fires</w:t>
       </w:r>
     </w:p>
     <w:p>
@@ -18001,24 +17721,6 @@
     </w:p>
     <w:p>
       <w:pPr>
-        <w:pStyle w:val="textbody"/>
-      </w:pPr>
-    </w:p>
-    <w:p>
-      <w:pPr>
-        <w:pStyle w:val="textbody"/>
-      </w:pPr>
-      <w:r>
-        <w:t>The information is stored as comma-separated values (CSV).</w:t>
-      </w:r>
-    </w:p>
-    <w:p>
-      <w:pPr>
-        <w:pStyle w:val="textbody"/>
-      </w:pPr>
-    </w:p>
-    <w:p>
-      <w:pPr>
         <w:pStyle w:val="Heading1"/>
         <w:spacing w:after="120"/>
       </w:pPr>
@@ -18034,23 +17736,19 @@
         <w:pStyle w:val="textbody"/>
       </w:pPr>
       <w:r>
-        <w:t xml:space="preserve">Sample input </w:t>
-      </w:r>
-      <w:proofErr w:type="gramStart"/>
-      <w:r>
-        <w:t>date</w:t>
-      </w:r>
-      <w:proofErr w:type="gramEnd"/>
+        <w:t>Sample input dat</w:t>
+      </w:r>
+      <w:r>
+        <w:t>a</w:t>
+      </w:r>
+      <w:r>
+        <w:t xml:space="preserve"> are available at</w:t>
+      </w:r>
+      <w:r>
+        <w:t>:</w:t>
+      </w:r>
       <w:r>
         <w:t xml:space="preserve"> </w:t>
-      </w:r>
-      <w:proofErr w:type="gramStart"/>
-      <w:r>
-        <w:t>are</w:t>
-      </w:r>
-      <w:proofErr w:type="gramEnd"/>
-      <w:r>
-        <w:t xml:space="preserve"> available at </w:t>
       </w:r>
     </w:p>
     <w:p>

</xml_diff>

<commit_message>
Minor update to documentation
</commit_message>
<xml_diff>
--- a/docs/LANDIS-II Social-Climate-Fire v4 User Guide.docx
+++ b/docs/LANDIS-II Social-Climate-Fire v4 User Guide.docx
@@ -9537,7 +9537,6 @@
         </w:rPr>
         <w:t xml:space="preserve">Social-Climate </w:t>
       </w:r>
-      <w:proofErr w:type="gramStart"/>
       <w:r>
         <w:rPr>
           <w:color w:val="333333"/>
@@ -9549,14 +9548,7 @@
         <w:rPr>
           <w:color w:val="333333"/>
         </w:rPr>
-        <w:t>(‘</w:t>
-      </w:r>
-      <w:proofErr w:type="gramEnd"/>
-      <w:r>
-        <w:rPr>
-          <w:color w:val="333333"/>
-        </w:rPr>
-        <w:t xml:space="preserve">SCF’) </w:t>
+        <w:t xml:space="preserve">(‘SCF’) </w:t>
       </w:r>
       <w:r>
         <w:t>e</w:t>
@@ -9620,15 +9612,7 @@
       </w:pPr>
       <w:bookmarkStart w:id="6" w:name="_Toc136162627"/>
       <w:r>
-        <w:t>We included three types of fires in the model:  Lightning, Human Unintentional (‘Accidental’), and Prescribed Fire (‘</w:t>
-      </w:r>
-      <w:proofErr w:type="spellStart"/>
-      <w:r>
-        <w:t>RxFire</w:t>
-      </w:r>
-      <w:proofErr w:type="spellEnd"/>
-      <w:r>
-        <w:t xml:space="preserve">’).  Each has its own ignition and suppression </w:t>
+        <w:t xml:space="preserve">We included three types of fires in the model:  Lightning, Human Unintentional (‘Accidental’), and Prescribed Fire (‘RxFire’).  Each has its own ignition and suppression </w:t>
       </w:r>
       <w:r>
         <w:t xml:space="preserve">and </w:t>
@@ -9648,13 +9632,8 @@
       <w:r>
         <w:t xml:space="preserve">behave similarly </w:t>
       </w:r>
-      <w:proofErr w:type="gramStart"/>
-      <w:r>
-        <w:t>in regards to</w:t>
-      </w:r>
-      <w:proofErr w:type="gramEnd"/>
-      <w:r>
-        <w:t xml:space="preserve"> spread and mortality.</w:t>
+      <w:r>
+        <w:t>in regards to spread and mortality.</w:t>
       </w:r>
       <w:r>
         <w:t xml:space="preserve">  Our model consists of </w:t>
@@ -10083,39 +10062,7 @@
       </w:pPr>
       <w:r>
         <w:lastRenderedPageBreak/>
-        <w:t xml:space="preserve">For </w:t>
-      </w:r>
-      <w:proofErr w:type="spellStart"/>
-      <w:r>
-        <w:t>RxFire</w:t>
-      </w:r>
-      <w:proofErr w:type="spellEnd"/>
-      <w:r>
-        <w:t xml:space="preserve">, a set number of fires are generated per year, based on expert input and/or scenario design.  For each day of the year, a single </w:t>
-      </w:r>
-      <w:proofErr w:type="spellStart"/>
-      <w:r>
-        <w:t>RxFire</w:t>
-      </w:r>
-      <w:proofErr w:type="spellEnd"/>
-      <w:r>
-        <w:t xml:space="preserve"> is attempted, given that FWI is within a specified range and that the wind speed is below an allowable maximum.  </w:t>
-      </w:r>
-      <w:proofErr w:type="spellStart"/>
-      <w:r>
-        <w:t>RxFires</w:t>
-      </w:r>
-      <w:proofErr w:type="spellEnd"/>
-      <w:r>
-        <w:t xml:space="preserve"> are attempted sequentially (by day of year) until the expected number of fires is successfully ignited.  Conditions are placed on </w:t>
-      </w:r>
-      <w:proofErr w:type="spellStart"/>
-      <w:r>
-        <w:t>RxFire</w:t>
-      </w:r>
-      <w:proofErr w:type="spellEnd"/>
-      <w:r>
-        <w:t xml:space="preserve"> ignitions based on a minimum FWI (necessary to maintain fire spread, below), a maximum FWI (conditions under which prescribed fire would be avoided), and a maximum wind speed (again, conditions under which prescribed fire would be avoided).</w:t>
+        <w:t>For RxFire, a set number of fires are generated per year, based on expert input and/or scenario design.  For each day of the year, a single RxFire is attempted, given that FWI is within a specified range and that the wind speed is below an allowable maximum.  RxFires are attempted sequentially (by day of year) until the expected number of fires is successfully ignited.  Conditions are placed on RxFire ignitions based on a minimum FWI (necessary to maintain fire spread, below), a maximum FWI (conditions under which prescribed fire would be avoided), and a maximum wind speed (again, conditions under which prescribed fire would be avoided).</w:t>
       </w:r>
     </w:p>
     <w:p>
@@ -10327,11 +10274,9 @@
       <w:r>
         <w:t>(</w:t>
       </w:r>
-      <w:proofErr w:type="spellStart"/>
       <w:r>
         <w:t>FineFuels</w:t>
       </w:r>
-      <w:proofErr w:type="spellEnd"/>
       <w:r>
         <w:t>)</w:t>
       </w:r>
@@ -10341,11 +10286,9 @@
       <w:r>
         <w:t>(</w:t>
       </w:r>
-      <w:proofErr w:type="spellStart"/>
       <w:r>
         <w:t>EffectiveWindSpeed</w:t>
       </w:r>
-      <w:proofErr w:type="spellEnd"/>
       <w:r>
         <w:t>)</w:t>
       </w:r>
@@ -10363,15 +10306,7 @@
         <w:br/>
       </w:r>
       <w:r>
-        <w:t xml:space="preserve">Where </w:t>
-      </w:r>
-      <w:proofErr w:type="spellStart"/>
-      <w:r>
-        <w:t>EffectiveWindSpeed</w:t>
-      </w:r>
-      <w:proofErr w:type="spellEnd"/>
-      <w:r>
-        <w:t xml:space="preserve"> is an adjusted wind speed </w:t>
+        <w:t xml:space="preserve">Where EffectiveWindSpeed is an adjusted wind speed </w:t>
       </w:r>
       <w:r>
         <w:t>(</w:t>
@@ -10388,27 +10323,14 @@
       <w:r>
         <w:t xml:space="preserve">whereby reported wind speed and direction for the region (from meteorological stations) is downscaled to individual sites by accounting for slope angle and the slope azimuth relative to the wind direction (see Nelson 2002 for complete information).  </w:t>
       </w:r>
-      <w:proofErr w:type="spellStart"/>
-      <w:r>
-        <w:t>EffectiveWindSpeed</w:t>
-      </w:r>
-      <w:proofErr w:type="spellEnd"/>
-      <w:r>
-        <w:t xml:space="preserve"> also incorporates the </w:t>
+      <w:r>
+        <w:t xml:space="preserve">EffectiveWindSpeed also incorporates the </w:t>
       </w:r>
       <w:r>
         <w:t xml:space="preserve">severity </w:t>
       </w:r>
       <w:r>
-        <w:t xml:space="preserve">of the source fire.  A high severity fire burning upslope generates a greater </w:t>
-      </w:r>
-      <w:proofErr w:type="spellStart"/>
-      <w:r>
-        <w:t>EffectiveWindSpeed</w:t>
-      </w:r>
-      <w:proofErr w:type="spellEnd"/>
-      <w:r>
-        <w:t xml:space="preserve"> than a moderate or light fire.  This in turn feeds back into the estimate of fire </w:t>
+        <w:t xml:space="preserve">of the source fire.  A high severity fire burning upslope generates a greater EffectiveWindSpeed than a moderate or light fire.  This in turn feeds back into the estimate of fire </w:t>
       </w:r>
       <w:r>
         <w:t xml:space="preserve">severity </w:t>
@@ -10523,15 +10445,7 @@
         <w:t xml:space="preserve">(ha) </w:t>
       </w:r>
       <w:r>
-        <w:t>= β0 + β1 * FWI + β2*</w:t>
-      </w:r>
-      <w:proofErr w:type="spellStart"/>
-      <w:r>
-        <w:t>EffectiveWindSpeed</w:t>
-      </w:r>
-      <w:proofErr w:type="spellEnd"/>
-      <w:r>
-        <w:t xml:space="preserve"> </w:t>
+        <w:t xml:space="preserve">= β0 + β1 * FWI + β2*EffectiveWindSpeed </w:t>
       </w:r>
       <w:r>
         <w:tab/>
@@ -10752,15 +10666,7 @@
         <w:t xml:space="preserve">Fire severity is the mortality caused by fire at each site and varies depending on the tree species and ages present. </w:t>
       </w:r>
       <w:r>
-        <w:t xml:space="preserve">Severity is represented in two stages to align with available data on severity and the understanding of mortality within a fire. The first is site level mortality, which is built to align with gridded observation of fire severity (such as those available in the </w:t>
-      </w:r>
-      <w:proofErr w:type="spellStart"/>
-      <w:r>
-        <w:t>dNBR</w:t>
-      </w:r>
-      <w:proofErr w:type="spellEnd"/>
-      <w:r>
-        <w:t xml:space="preserve"> style maps). This represents the cells experience of mortality without regard individual species presence. Site level severity is calculated as </w:t>
+        <w:t xml:space="preserve">Severity is represented in two stages to align with available data on severity and the understanding of mortality within a fire. The first is site level mortality, which is built to align with gridded observation of fire severity (such as those available in the dNBR style maps). This represents the cells experience of mortality without regard individual species presence. Site level severity is calculated as </w:t>
       </w:r>
       <w:r>
         <w:t xml:space="preserve">with an </w:t>
@@ -11101,15 +11007,7 @@
         <w:ind w:left="720"/>
       </w:pPr>
       <w:r>
-        <w:t xml:space="preserve">Where Clay % is the percentage of soil that is clay based, ET is the previous </w:t>
-      </w:r>
-      <w:proofErr w:type="spellStart"/>
-      <w:r>
-        <w:t>years</w:t>
-      </w:r>
-      <w:proofErr w:type="spellEnd"/>
-      <w:r>
-        <w:t xml:space="preserve"> evapotranspiration by calculated with the model, Eff. Windspeed is the effective windspeed as described in above in fire spread, CWD is the climatic water deficit (potential evapotranspiration – evapotranspiration) calculated within the model, and Fuels is the fine fuels calculated within the model and described above in fire spread. This requires calculation of each of the variables </w:t>
+        <w:t xml:space="preserve">Where Clay % is the percentage of soil that is clay based, ET is the previous years evapotranspiration by calculated with the model, Eff. Windspeed is the effective windspeed as described in above in fire spread, CWD is the climatic water deficit (potential evapotranspiration – evapotranspiration) calculated within the model, and Fuels is the fine fuels calculated within the model and described above in fire spread. This requires calculation of each of the variables </w:t>
       </w:r>
       <w:r>
         <w:t>b</w:t>
@@ -11349,23 +11247,7 @@
         <w:ind w:left="720"/>
       </w:pPr>
       <w:r>
-        <w:t xml:space="preserve">The model for bark thickness is based on species and </w:t>
-      </w:r>
-      <w:proofErr w:type="spellStart"/>
-      <w:r>
-        <w:t>dbh</w:t>
-      </w:r>
-      <w:proofErr w:type="spellEnd"/>
-      <w:r>
-        <w:t xml:space="preserve">. To model bark thickness, </w:t>
-      </w:r>
-      <w:proofErr w:type="spellStart"/>
-      <w:r>
-        <w:t>dbh</w:t>
-      </w:r>
-      <w:proofErr w:type="spellEnd"/>
-      <w:r>
-        <w:t xml:space="preserve"> is converted to bark thickness using linear scaling from the Fire Tree Mortality Database (Cansler et al., 2020). To relate bark thickness to age, the following equation is used:</w:t>
+        <w:t>The model for bark thickness is based on species and dbh. To model bark thickness, dbh is converted to bark thickness using linear scaling from the Fire Tree Mortality Database (Cansler et al., 2020). To relate bark thickness to age, the following equation is used:</w:t>
       </w:r>
     </w:p>
     <w:p>
@@ -11373,14 +11255,12 @@
         <w:pStyle w:val="textbody"/>
         <w:ind w:left="720"/>
       </w:pPr>
-      <w:proofErr w:type="spellStart"/>
       <w:r>
         <w:t>Bark</w:t>
       </w:r>
       <w:r>
         <w:t>Thickness</w:t>
       </w:r>
-      <w:proofErr w:type="spellEnd"/>
       <w:r>
         <w:t xml:space="preserve"> = </w:t>
       </w:r>
@@ -11766,252 +11646,236 @@
           <w:color w:val="222222"/>
           <w:shd w:val="clear" w:color="auto" w:fill="FFFFFF"/>
         </w:rPr>
-        <w:t xml:space="preserve">J. van </w:t>
-      </w:r>
-      <w:proofErr w:type="spellStart"/>
+        <w:t xml:space="preserve">J. van Mantgem, </w:t>
+      </w:r>
       <w:r>
         <w:rPr>
           <w:color w:val="222222"/>
           <w:shd w:val="clear" w:color="auto" w:fill="FFFFFF"/>
         </w:rPr>
-        <w:t>Mantgem</w:t>
-      </w:r>
-      <w:proofErr w:type="spellEnd"/>
+        <w:t>M.</w:t>
+      </w:r>
       <w:r>
         <w:rPr>
           <w:color w:val="222222"/>
           <w:shd w:val="clear" w:color="auto" w:fill="FFFFFF"/>
         </w:rPr>
-        <w:t xml:space="preserve">, </w:t>
+        <w:t>C.</w:t>
       </w:r>
       <w:r>
         <w:rPr>
           <w:color w:val="222222"/>
           <w:shd w:val="clear" w:color="auto" w:fill="FFFFFF"/>
         </w:rPr>
-        <w:t>M.</w:t>
+        <w:t xml:space="preserve"> </w:t>
       </w:r>
       <w:r>
         <w:rPr>
           <w:color w:val="222222"/>
           <w:shd w:val="clear" w:color="auto" w:fill="FFFFFF"/>
         </w:rPr>
-        <w:t>C.</w:t>
+        <w:t xml:space="preserve">Agne, </w:t>
       </w:r>
       <w:r>
         <w:rPr>
           <w:color w:val="222222"/>
           <w:shd w:val="clear" w:color="auto" w:fill="FFFFFF"/>
         </w:rPr>
-        <w:t xml:space="preserve"> </w:t>
+        <w:t>R.</w:t>
       </w:r>
       <w:r>
         <w:rPr>
           <w:color w:val="222222"/>
           <w:shd w:val="clear" w:color="auto" w:fill="FFFFFF"/>
         </w:rPr>
-        <w:t xml:space="preserve">Agne, </w:t>
+        <w:t xml:space="preserve">A. Andrus, </w:t>
       </w:r>
       <w:r>
         <w:rPr>
           <w:color w:val="222222"/>
           <w:shd w:val="clear" w:color="auto" w:fill="FFFFFF"/>
         </w:rPr>
-        <w:t>R.</w:t>
+        <w:t>M.</w:t>
       </w:r>
       <w:r>
         <w:rPr>
           <w:color w:val="222222"/>
           <w:shd w:val="clear" w:color="auto" w:fill="FFFFFF"/>
         </w:rPr>
-        <w:t xml:space="preserve">A. Andrus, </w:t>
+        <w:t>P. Ayres, et al. 2020. The Fire and Tree Mortality Database,</w:t>
       </w:r>
       <w:r>
         <w:rPr>
           <w:color w:val="222222"/>
           <w:shd w:val="clear" w:color="auto" w:fill="FFFFFF"/>
         </w:rPr>
-        <w:t>M.</w:t>
+        <w:t xml:space="preserve"> </w:t>
       </w:r>
       <w:r>
         <w:rPr>
           <w:color w:val="222222"/>
           <w:shd w:val="clear" w:color="auto" w:fill="FFFFFF"/>
         </w:rPr>
-        <w:t>P. Ayres, et al. 2020. The Fire and Tree Mortality Database,</w:t>
-      </w:r>
-      <w:r>
+        <w:t>for Empirical Modeling of Individual Tree Mortality after Fire. Scientific Data 7: 194.https://doi.org/10.1038/s41597-020-0522-7.</w:t>
+      </w:r>
+    </w:p>
+    <w:p>
+      <w:pPr>
+        <w:pStyle w:val="reference"/>
         <w:rPr>
           <w:color w:val="222222"/>
           <w:shd w:val="clear" w:color="auto" w:fill="FFFFFF"/>
         </w:rPr>
-        <w:t xml:space="preserve"> </w:t>
-      </w:r>
+      </w:pPr>
       <w:r>
         <w:rPr>
           <w:color w:val="222222"/>
           <w:shd w:val="clear" w:color="auto" w:fill="FFFFFF"/>
         </w:rPr>
-        <w:t>for Empirical Modeling of Individual Tree Mortality after Fire. Scientific Data 7: 194.https://doi.org/10.1038/s41597-020-0522-7.</w:t>
-      </w:r>
-    </w:p>
-    <w:p>
-      <w:pPr>
-        <w:pStyle w:val="reference"/>
+        <w:t>Nelson</w:t>
+      </w:r>
+      <w:r>
         <w:rPr>
           <w:color w:val="222222"/>
           <w:shd w:val="clear" w:color="auto" w:fill="FFFFFF"/>
         </w:rPr>
-      </w:pPr>
+        <w:t>,</w:t>
+      </w:r>
       <w:r>
         <w:rPr>
           <w:color w:val="222222"/>
           <w:shd w:val="clear" w:color="auto" w:fill="FFFFFF"/>
         </w:rPr>
-        <w:t>Nelson</w:t>
+        <w:t xml:space="preserve"> R</w:t>
       </w:r>
       <w:r>
         <w:rPr>
           <w:color w:val="222222"/>
           <w:shd w:val="clear" w:color="auto" w:fill="FFFFFF"/>
         </w:rPr>
-        <w:t>,</w:t>
+        <w:t>.</w:t>
       </w:r>
       <w:r>
         <w:rPr>
           <w:color w:val="222222"/>
           <w:shd w:val="clear" w:color="auto" w:fill="FFFFFF"/>
         </w:rPr>
-        <w:t xml:space="preserve"> R</w:t>
+        <w:t>M</w:t>
       </w:r>
       <w:r>
         <w:rPr>
           <w:color w:val="222222"/>
           <w:shd w:val="clear" w:color="auto" w:fill="FFFFFF"/>
         </w:rPr>
-        <w:t>.</w:t>
+        <w:t xml:space="preserve">. </w:t>
       </w:r>
       <w:r>
         <w:rPr>
           <w:color w:val="222222"/>
           <w:shd w:val="clear" w:color="auto" w:fill="FFFFFF"/>
         </w:rPr>
-        <w:t>M</w:t>
+        <w:t>2002</w:t>
       </w:r>
       <w:r>
         <w:rPr>
           <w:color w:val="222222"/>
           <w:shd w:val="clear" w:color="auto" w:fill="FFFFFF"/>
         </w:rPr>
-        <w:t xml:space="preserve">. </w:t>
+        <w:t>.</w:t>
       </w:r>
       <w:r>
         <w:rPr>
           <w:color w:val="222222"/>
           <w:shd w:val="clear" w:color="auto" w:fill="FFFFFF"/>
         </w:rPr>
-        <w:t>2002</w:t>
+        <w:t xml:space="preserve"> An effective wind speed for models of fire spread.</w:t>
       </w:r>
       <w:r>
         <w:rPr>
           <w:color w:val="222222"/>
           <w:shd w:val="clear" w:color="auto" w:fill="FFFFFF"/>
         </w:rPr>
-        <w:t>.</w:t>
+        <w:t xml:space="preserve"> </w:t>
+      </w:r>
+      <w:r>
+        <w:rPr>
+          <w:iCs/>
+          <w:color w:val="222222"/>
+        </w:rPr>
+        <w:t>International Journal of Wildland Fire</w:t>
+      </w:r>
+      <w:r>
+        <w:rPr>
+          <w:bCs/>
+          <w:color w:val="222222"/>
+        </w:rPr>
+        <w:t xml:space="preserve"> </w:t>
+      </w:r>
+      <w:r>
+        <w:rPr>
+          <w:bCs/>
+          <w:color w:val="222222"/>
+        </w:rPr>
+        <w:t>11</w:t>
       </w:r>
       <w:r>
         <w:rPr>
           <w:color w:val="222222"/>
           <w:shd w:val="clear" w:color="auto" w:fill="FFFFFF"/>
         </w:rPr>
-        <w:t xml:space="preserve"> An effective wind speed for models of fire spread.</w:t>
+        <w:t xml:space="preserve">: </w:t>
       </w:r>
       <w:r>
         <w:rPr>
           <w:color w:val="222222"/>
           <w:shd w:val="clear" w:color="auto" w:fill="FFFFFF"/>
         </w:rPr>
-        <w:t xml:space="preserve"> </w:t>
-      </w:r>
-      <w:r>
+        <w:t>153–161. </w:t>
+      </w:r>
+    </w:p>
+    <w:p>
+      <w:pPr>
+        <w:pStyle w:val="reference"/>
         <w:rPr>
           <w:iCs/>
           <w:color w:val="222222"/>
         </w:rPr>
-        <w:t>International Journal of Wildland Fire</w:t>
-      </w:r>
-      <w:r>
-        <w:rPr>
-          <w:bCs/>
-          <w:color w:val="222222"/>
-        </w:rPr>
-        <w:t xml:space="preserve"> </w:t>
-      </w:r>
-      <w:r>
-        <w:rPr>
-          <w:bCs/>
-          <w:color w:val="222222"/>
-        </w:rPr>
-        <w:t>11</w:t>
-      </w:r>
-      <w:r>
-        <w:rPr>
-          <w:color w:val="222222"/>
-          <w:shd w:val="clear" w:color="auto" w:fill="FFFFFF"/>
-        </w:rPr>
-        <w:t xml:space="preserve">: </w:t>
-      </w:r>
-      <w:r>
-        <w:rPr>
-          <w:color w:val="222222"/>
-          <w:shd w:val="clear" w:color="auto" w:fill="FFFFFF"/>
-        </w:rPr>
-        <w:t>153–161. </w:t>
-      </w:r>
-    </w:p>
-    <w:p>
-      <w:pPr>
-        <w:pStyle w:val="reference"/>
+      </w:pPr>
+      <w:r>
         <w:rPr>
           <w:iCs/>
           <w:color w:val="222222"/>
         </w:rPr>
-      </w:pPr>
+        <w:t>Robbins, Z.J., E.L. Loudermilk, M.J. Reilly, J.J. O'Brien, K. Jones, C.T. Gerstle, R.M. Scheller. 2022. Delayed fire mortality has long-term ecological effects across the Southern Appalachian landscape. Ecosphere 13: e4153.</w:t>
+      </w:r>
       <w:r>
         <w:rPr>
           <w:iCs/>
           <w:color w:val="222222"/>
         </w:rPr>
-        <w:t>Robbins, Z.J., E.L. Loudermilk, M.J. Reilly, J.J. O'Brien, K. Jones, C.T. Gerstle, R.M. Scheller. 2022. Delayed fire mortality has long-term ecological effects across the Southern Appalachian landscape. Ecosphere 13: e4153.</w:t>
+        <w:t xml:space="preserve"> </w:t>
       </w:r>
       <w:r>
         <w:rPr>
           <w:iCs/>
           <w:color w:val="222222"/>
         </w:rPr>
-        <w:t xml:space="preserve"> </w:t>
-      </w:r>
-      <w:r>
+        <w:t>https://esajournals.onlinelibrary.wiley.com/doi/full/10.1002/ecs2.4153</w:t>
+      </w:r>
+    </w:p>
+    <w:p>
+      <w:pPr>
+        <w:pStyle w:val="reference"/>
         <w:rPr>
           <w:iCs/>
           <w:color w:val="222222"/>
         </w:rPr>
-        <w:t>https://esajournals.onlinelibrary.wiley.com/doi/full/10.1002/ecs2.4153</w:t>
-      </w:r>
-    </w:p>
-    <w:p>
-      <w:pPr>
-        <w:pStyle w:val="reference"/>
+      </w:pPr>
+      <w:r>
         <w:rPr>
           <w:iCs/>
           <w:color w:val="222222"/>
         </w:rPr>
-      </w:pPr>
-      <w:r>
-        <w:rPr>
-          <w:iCs/>
-          <w:color w:val="222222"/>
-        </w:rPr>
         <w:t>Scheller, R.M., A. Kretchun, T.J. Hawbaker, P.D. Henne. 2019. A landscape model of variable social-ecological fire regimes. Ecological Modelling 401: 85-93.</w:t>
       </w:r>
     </w:p>
@@ -12069,15 +11933,7 @@
         <w:pStyle w:val="textbody"/>
       </w:pPr>
       <w:r>
-        <w:t>A new optional parameter was added, ‘</w:t>
-      </w:r>
-      <w:proofErr w:type="spellStart"/>
-      <w:r>
-        <w:t>BurningSiteThreshold</w:t>
-      </w:r>
-      <w:proofErr w:type="spellEnd"/>
-      <w:r>
-        <w:t>’ that will infill unburned sites within an overall burn perimeter based on the number of neighbors that burned.  This removes some of the ‘pixelation’ that can result from low spread probabilities.</w:t>
+        <w:t>A new optional parameter was added, ‘BurningSiteThreshold’ that will infill unburned sites within an overall burn perimeter based on the number of neighbors that burned.  This removes some of the ‘pixelation’ that can result from low spread probabilities.</w:t>
       </w:r>
     </w:p>
     <w:p>
@@ -12160,15 +12016,7 @@
         <w:pStyle w:val="textbody"/>
       </w:pPr>
       <w:r>
-        <w:t xml:space="preserve">The climate library was updated to v4.2.  Also added a </w:t>
-      </w:r>
-      <w:proofErr w:type="spellStart"/>
-      <w:r>
-        <w:t>dNBR</w:t>
-      </w:r>
-      <w:proofErr w:type="spellEnd"/>
-      <w:r>
-        <w:t xml:space="preserve"> output map.  Minor fixes to documentation and fine fuels.</w:t>
+        <w:t>The climate library was updated to v4.2.  Also added a dNBR output map.  Minor fixes to documentation and fine fuels.</w:t>
       </w:r>
     </w:p>
     <w:p>
@@ -12305,7 +12153,6 @@
       <w:bookmarkStart w:id="28" w:name="_Toc133386213"/>
       <w:bookmarkStart w:id="29" w:name="_Toc136162630"/>
       <w:bookmarkStart w:id="30" w:name="_Toc235010966"/>
-      <w:proofErr w:type="spellStart"/>
       <w:r>
         <w:t>LandisData</w:t>
       </w:r>
@@ -12313,7 +12160,6 @@
       <w:bookmarkEnd w:id="28"/>
       <w:bookmarkEnd w:id="29"/>
       <w:bookmarkEnd w:id="30"/>
-      <w:proofErr w:type="spellEnd"/>
     </w:p>
     <w:p>
       <w:pPr>
@@ -12395,13 +12241,8 @@
         <w:pStyle w:val="Heading2"/>
       </w:pPr>
       <w:bookmarkStart w:id="35" w:name="_Toc235010968"/>
-      <w:proofErr w:type="spellStart"/>
-      <w:r>
-        <w:t>TimeZeroPET</w:t>
-      </w:r>
-      <w:proofErr w:type="spellEnd"/>
-      <w:r>
-        <w:t xml:space="preserve"> (optional double)</w:t>
+      <w:r>
+        <w:t>TimeZeroPET (optional double)</w:t>
       </w:r>
       <w:bookmarkEnd w:id="35"/>
     </w:p>
@@ -12418,13 +12259,8 @@
         <w:pStyle w:val="Heading2"/>
       </w:pPr>
       <w:bookmarkStart w:id="36" w:name="_Toc235010969"/>
-      <w:proofErr w:type="spellStart"/>
-      <w:r>
-        <w:t>TimeZeroCWD</w:t>
-      </w:r>
-      <w:proofErr w:type="spellEnd"/>
-      <w:r>
-        <w:t xml:space="preserve"> (optional double)</w:t>
+      <w:r>
+        <w:t>TimeZeroCWD (optional double)</w:t>
       </w:r>
       <w:bookmarkEnd w:id="36"/>
     </w:p>
@@ -12441,12 +12277,10 @@
         <w:pStyle w:val="Heading2"/>
       </w:pPr>
       <w:bookmarkStart w:id="37" w:name="_Toc235010970"/>
-      <w:proofErr w:type="spellStart"/>
       <w:r>
         <w:t>Species_CSV_File</w:t>
       </w:r>
       <w:bookmarkEnd w:id="37"/>
-      <w:proofErr w:type="spellEnd"/>
     </w:p>
     <w:p>
       <w:pPr>
@@ -12459,15 +12293,7 @@
         <w:t xml:space="preserve">parameter specifies the </w:t>
       </w:r>
       <w:r>
-        <w:t>location of a .csv file containing the columns “</w:t>
-      </w:r>
-      <w:proofErr w:type="spellStart"/>
-      <w:r>
-        <w:t>SpeciesCode</w:t>
-      </w:r>
-      <w:proofErr w:type="spellEnd"/>
-      <w:r>
-        <w:t>”,</w:t>
+        <w:t>location of a .csv file containing the columns “SpeciesCode”,</w:t>
       </w:r>
       <w:r>
         <w:t xml:space="preserve"> </w:t>
@@ -12475,22 +12301,15 @@
       <w:r>
         <w:t>“</w:t>
       </w:r>
-      <w:proofErr w:type="spellStart"/>
-      <w:r>
-        <w:t>AgeDBH</w:t>
-      </w:r>
-      <w:proofErr w:type="spellEnd"/>
-      <w:r>
-        <w:t>”</w:t>
+      <w:r>
+        <w:t>AgeDBH”</w:t>
       </w:r>
       <w:r>
         <w:t>,”</w:t>
       </w:r>
-      <w:proofErr w:type="spellStart"/>
       <w:r>
         <w:t>MaximumBarkThickness</w:t>
       </w:r>
-      <w:proofErr w:type="spellEnd"/>
       <w:r>
         <w:t xml:space="preserve">”. Each row should be a species </w:t>
       </w:r>
@@ -12518,15 +12337,13 @@
         <w:pStyle w:val="Heading2"/>
         <w:spacing w:after="120"/>
       </w:pPr>
-      <w:bookmarkStart w:id="38" w:name="_Toc136162634"/>
-      <w:bookmarkStart w:id="39" w:name="_Ref272935309"/>
-      <w:bookmarkStart w:id="40" w:name="_Toc235010971"/>
-      <w:proofErr w:type="spellStart"/>
+      <w:bookmarkStart w:id="38" w:name="_Toc235010971"/>
+      <w:bookmarkStart w:id="39" w:name="_Toc136162634"/>
+      <w:bookmarkStart w:id="40" w:name="_Ref272935309"/>
       <w:r>
         <w:t>AccidentalIgnitionsMap</w:t>
       </w:r>
-      <w:bookmarkEnd w:id="40"/>
-      <w:proofErr w:type="spellEnd"/>
+      <w:bookmarkEnd w:id="38"/>
     </w:p>
     <w:p>
       <w:pPr>
@@ -12640,13 +12457,8 @@
         <w:spacing w:after="120"/>
       </w:pPr>
       <w:bookmarkStart w:id="41" w:name="_Toc235010972"/>
-      <w:proofErr w:type="spellStart"/>
-      <w:r>
-        <w:t>DynamicAccidentalIgnitionMaps</w:t>
-      </w:r>
-      <w:proofErr w:type="spellEnd"/>
-      <w:r>
-        <w:t xml:space="preserve"> (Optional)</w:t>
+      <w:r>
+        <w:t>DynamicAccidentalIgnitionMaps (Optional)</w:t>
       </w:r>
       <w:bookmarkEnd w:id="41"/>
     </w:p>
@@ -12694,7 +12506,6 @@
           <w:szCs w:val="20"/>
         </w:rPr>
       </w:pPr>
-      <w:proofErr w:type="spellStart"/>
       <w:r>
         <w:rPr>
           <w:rFonts w:ascii="Courier New" w:hAnsi="Courier New" w:cs="Courier New"/>
@@ -12717,34 +12528,33 @@
           <w:sz w:val="20"/>
           <w:szCs w:val="20"/>
         </w:rPr>
-        <w:t>IgnitionMaps</w:t>
-      </w:r>
-      <w:proofErr w:type="spellEnd"/>
-      <w:r>
+        <w:t>IgnitionMaps &lt;&lt; Optional</w:t>
+      </w:r>
+    </w:p>
+    <w:p>
+      <w:pPr>
+        <w:pStyle w:val="textbody"/>
         <w:rPr>
           <w:rFonts w:ascii="Courier New" w:hAnsi="Courier New" w:cs="Courier New"/>
           <w:sz w:val="20"/>
           <w:szCs w:val="20"/>
         </w:rPr>
-        <w:t xml:space="preserve"> &lt;&lt; Optional</w:t>
-      </w:r>
-    </w:p>
-    <w:p>
-      <w:pPr>
-        <w:pStyle w:val="textbody"/>
+      </w:pPr>
+      <w:r>
         <w:rPr>
           <w:rFonts w:ascii="Courier New" w:hAnsi="Courier New" w:cs="Courier New"/>
           <w:sz w:val="20"/>
           <w:szCs w:val="20"/>
         </w:rPr>
-      </w:pPr>
+        <w:t>3</w:t>
+      </w:r>
       <w:r>
         <w:rPr>
           <w:rFonts w:ascii="Courier New" w:hAnsi="Courier New" w:cs="Courier New"/>
           <w:sz w:val="20"/>
           <w:szCs w:val="20"/>
         </w:rPr>
-        <w:t>3</w:t>
+        <w:tab/>
       </w:r>
       <w:r>
         <w:rPr>
@@ -12753,6 +12563,7 @@
           <w:szCs w:val="20"/>
         </w:rPr>
         <w:tab/>
+        <w:t>AccIgnitions</w:t>
       </w:r>
       <w:r>
         <w:rPr>
@@ -12760,34 +12571,33 @@
           <w:sz w:val="20"/>
           <w:szCs w:val="20"/>
         </w:rPr>
-        <w:tab/>
-        <w:t>AccIgnitions</w:t>
-      </w:r>
-      <w:r>
+        <w:t xml:space="preserve">3.img </w:t>
+      </w:r>
+    </w:p>
+    <w:p>
+      <w:pPr>
+        <w:pStyle w:val="textbody"/>
         <w:rPr>
           <w:rFonts w:ascii="Courier New" w:hAnsi="Courier New" w:cs="Courier New"/>
           <w:sz w:val="20"/>
           <w:szCs w:val="20"/>
         </w:rPr>
-        <w:t xml:space="preserve">3.img </w:t>
-      </w:r>
-    </w:p>
-    <w:p>
-      <w:pPr>
-        <w:pStyle w:val="textbody"/>
+      </w:pPr>
+      <w:r>
         <w:rPr>
           <w:rFonts w:ascii="Courier New" w:hAnsi="Courier New" w:cs="Courier New"/>
           <w:sz w:val="20"/>
           <w:szCs w:val="20"/>
         </w:rPr>
-      </w:pPr>
+        <w:t>5</w:t>
+      </w:r>
       <w:r>
         <w:rPr>
           <w:rFonts w:ascii="Courier New" w:hAnsi="Courier New" w:cs="Courier New"/>
           <w:sz w:val="20"/>
           <w:szCs w:val="20"/>
         </w:rPr>
-        <w:t>5</w:t>
+        <w:tab/>
       </w:r>
       <w:r>
         <w:rPr>
@@ -12796,6 +12606,7 @@
           <w:szCs w:val="20"/>
         </w:rPr>
         <w:tab/>
+        <w:t>AccIgnitions5</w:t>
       </w:r>
       <w:r>
         <w:rPr>
@@ -12803,34 +12614,33 @@
           <w:sz w:val="20"/>
           <w:szCs w:val="20"/>
         </w:rPr>
-        <w:tab/>
-        <w:t>AccIgnitions5</w:t>
-      </w:r>
-      <w:r>
+        <w:t xml:space="preserve">.img </w:t>
+      </w:r>
+    </w:p>
+    <w:p>
+      <w:pPr>
+        <w:pStyle w:val="textbody"/>
         <w:rPr>
           <w:rFonts w:ascii="Courier New" w:hAnsi="Courier New" w:cs="Courier New"/>
           <w:sz w:val="20"/>
           <w:szCs w:val="20"/>
         </w:rPr>
-        <w:t xml:space="preserve">.img </w:t>
-      </w:r>
-    </w:p>
-    <w:p>
-      <w:pPr>
-        <w:pStyle w:val="textbody"/>
+      </w:pPr>
+      <w:r>
         <w:rPr>
           <w:rFonts w:ascii="Courier New" w:hAnsi="Courier New" w:cs="Courier New"/>
           <w:sz w:val="20"/>
           <w:szCs w:val="20"/>
         </w:rPr>
-      </w:pPr>
+        <w:t>13</w:t>
+      </w:r>
       <w:r>
         <w:rPr>
           <w:rFonts w:ascii="Courier New" w:hAnsi="Courier New" w:cs="Courier New"/>
           <w:sz w:val="20"/>
           <w:szCs w:val="20"/>
         </w:rPr>
-        <w:t>13</w:t>
+        <w:tab/>
       </w:r>
       <w:r>
         <w:rPr>
@@ -12839,6 +12649,7 @@
           <w:szCs w:val="20"/>
         </w:rPr>
         <w:tab/>
+        <w:t>AccIgnitions1</w:t>
       </w:r>
       <w:r>
         <w:rPr>
@@ -12846,125 +12657,116 @@
           <w:sz w:val="20"/>
           <w:szCs w:val="20"/>
         </w:rPr>
-        <w:tab/>
-        <w:t>AccIgnitions1</w:t>
-      </w:r>
-      <w:r>
+        <w:t>3.img</w:t>
+      </w:r>
+    </w:p>
+    <w:p>
+      <w:pPr>
+        <w:pStyle w:val="Heading2"/>
+        <w:spacing w:after="120"/>
+      </w:pPr>
+      <w:bookmarkStart w:id="42" w:name="_Toc235010973"/>
+      <w:r>
+        <w:t>LightningIgnitionsMap</w:t>
+      </w:r>
+      <w:bookmarkEnd w:id="42"/>
+    </w:p>
+    <w:p>
+      <w:pPr>
+        <w:pStyle w:val="textbody"/>
+      </w:pPr>
+      <w:r>
+        <w:t xml:space="preserve">This parameter specifies a raster map </w:t>
+      </w:r>
+      <w:r>
+        <w:t xml:space="preserve">that ranks </w:t>
+      </w:r>
+      <w:r>
+        <w:t xml:space="preserve">where lightning ignitions </w:t>
+      </w:r>
+      <w:r>
+        <w:t xml:space="preserve">will </w:t>
+      </w:r>
+      <w:r>
+        <w:t xml:space="preserve">occur.  </w:t>
+      </w:r>
+      <w:r>
+        <w:t>See the entry for Accidental Ignitions Map for further details.</w:t>
+      </w:r>
+    </w:p>
+    <w:p>
+      <w:pPr>
+        <w:pStyle w:val="Heading2"/>
+        <w:spacing w:after="120"/>
+      </w:pPr>
+      <w:bookmarkStart w:id="43" w:name="_Toc235010974"/>
+      <w:bookmarkStart w:id="44" w:name="_Toc136162636"/>
+      <w:bookmarkEnd w:id="39"/>
+      <w:bookmarkEnd w:id="40"/>
+      <w:r>
+        <w:t>DynamicLightningIgnitionMaps (Optional)</w:t>
+      </w:r>
+      <w:bookmarkEnd w:id="43"/>
+    </w:p>
+    <w:p>
+      <w:pPr>
+        <w:pStyle w:val="textbody"/>
+      </w:pPr>
+      <w:r>
+        <w:t xml:space="preserve">This </w:t>
+      </w:r>
+      <w:r>
+        <w:rPr>
+          <w:b/>
+        </w:rPr>
+        <w:t>optional table</w:t>
+      </w:r>
+      <w:r>
+        <w:t xml:space="preserve"> allows you to change lightning fire ignition maps for any given year.  The table contains </w:t>
+      </w:r>
+      <w:r>
+        <w:rPr>
+          <w:b/>
+        </w:rPr>
+        <w:t>simulation year</w:t>
+      </w:r>
+      <w:r>
+        <w:t xml:space="preserve"> and </w:t>
+      </w:r>
+      <w:r>
+        <w:rPr>
+          <w:b/>
+        </w:rPr>
+        <w:t>map name</w:t>
+      </w:r>
+      <w:r>
+        <w:t>, each pair on a separate line.</w:t>
+      </w:r>
+    </w:p>
+    <w:p>
+      <w:pPr>
+        <w:pStyle w:val="textbody"/>
         <w:rPr>
           <w:rFonts w:ascii="Courier New" w:hAnsi="Courier New" w:cs="Courier New"/>
           <w:sz w:val="20"/>
           <w:szCs w:val="20"/>
         </w:rPr>
-        <w:t>3.img</w:t>
-      </w:r>
-    </w:p>
-    <w:p>
-      <w:pPr>
-        <w:pStyle w:val="Heading2"/>
-        <w:spacing w:after="120"/>
-      </w:pPr>
-      <w:bookmarkStart w:id="42" w:name="_Toc235010973"/>
-      <w:proofErr w:type="spellStart"/>
-      <w:r>
-        <w:t>LightningIgnitionsMap</w:t>
-      </w:r>
-      <w:bookmarkEnd w:id="42"/>
-      <w:proofErr w:type="spellEnd"/>
-    </w:p>
-    <w:p>
-      <w:pPr>
-        <w:pStyle w:val="textbody"/>
-      </w:pPr>
-      <w:r>
-        <w:t xml:space="preserve">This parameter specifies a raster map </w:t>
-      </w:r>
-      <w:r>
-        <w:t xml:space="preserve">that ranks </w:t>
-      </w:r>
-      <w:r>
-        <w:t xml:space="preserve">where lightning ignitions </w:t>
-      </w:r>
-      <w:r>
-        <w:t xml:space="preserve">will </w:t>
-      </w:r>
-      <w:r>
-        <w:t xml:space="preserve">occur.  </w:t>
-      </w:r>
-      <w:r>
-        <w:t>See the entry for Accidental Ignitions Map for further details.</w:t>
-      </w:r>
-    </w:p>
-    <w:p>
-      <w:pPr>
-        <w:pStyle w:val="Heading2"/>
-        <w:spacing w:after="120"/>
-      </w:pPr>
-      <w:bookmarkStart w:id="43" w:name="_Toc136162636"/>
-      <w:bookmarkStart w:id="44" w:name="_Toc235010974"/>
-      <w:bookmarkEnd w:id="38"/>
-      <w:bookmarkEnd w:id="39"/>
-      <w:proofErr w:type="spellStart"/>
-      <w:r>
-        <w:t>DynamicLightningIgnitionMaps</w:t>
-      </w:r>
-      <w:proofErr w:type="spellEnd"/>
-      <w:r>
-        <w:t xml:space="preserve"> (Optional)</w:t>
-      </w:r>
-      <w:bookmarkEnd w:id="44"/>
-    </w:p>
-    <w:p>
-      <w:pPr>
-        <w:pStyle w:val="textbody"/>
-      </w:pPr>
-      <w:r>
-        <w:t xml:space="preserve">This </w:t>
-      </w:r>
-      <w:r>
-        <w:rPr>
-          <w:b/>
-        </w:rPr>
-        <w:t>optional table</w:t>
-      </w:r>
-      <w:r>
-        <w:t xml:space="preserve"> allows you to change lightning fire ignition maps for any given year.  The table contains </w:t>
-      </w:r>
-      <w:r>
-        <w:rPr>
-          <w:b/>
-        </w:rPr>
-        <w:t>simulation year</w:t>
-      </w:r>
-      <w:r>
-        <w:t xml:space="preserve"> and </w:t>
-      </w:r>
-      <w:r>
-        <w:rPr>
-          <w:b/>
-        </w:rPr>
-        <w:t>map name</w:t>
-      </w:r>
-      <w:r>
-        <w:t>, each pair on a separate line.</w:t>
-      </w:r>
-    </w:p>
-    <w:p>
-      <w:pPr>
-        <w:pStyle w:val="textbody"/>
+      </w:pPr>
+      <w:r>
         <w:rPr>
           <w:rFonts w:ascii="Courier New" w:hAnsi="Courier New" w:cs="Courier New"/>
           <w:sz w:val="20"/>
           <w:szCs w:val="20"/>
         </w:rPr>
-      </w:pPr>
-      <w:proofErr w:type="spellStart"/>
+        <w:t>Dynamic</w:t>
+      </w:r>
       <w:r>
         <w:rPr>
           <w:rFonts w:ascii="Courier New" w:hAnsi="Courier New" w:cs="Courier New"/>
           <w:sz w:val="20"/>
           <w:szCs w:val="20"/>
         </w:rPr>
-        <w:t>Dynamic</w:t>
+        <w:t>Lightning</w:t>
       </w:r>
       <w:r>
         <w:rPr>
@@ -12972,42 +12774,42 @@
           <w:sz w:val="20"/>
           <w:szCs w:val="20"/>
         </w:rPr>
-        <w:t>Lightning</w:t>
-      </w:r>
-      <w:r>
+        <w:t>IgnitionMaps &lt;&lt; Optional</w:t>
+      </w:r>
+    </w:p>
+    <w:p>
+      <w:pPr>
+        <w:pStyle w:val="textbody"/>
         <w:rPr>
           <w:rFonts w:ascii="Courier New" w:hAnsi="Courier New" w:cs="Courier New"/>
           <w:sz w:val="20"/>
           <w:szCs w:val="20"/>
         </w:rPr>
-        <w:t>IgnitionMaps</w:t>
-      </w:r>
-      <w:proofErr w:type="spellEnd"/>
+      </w:pPr>
       <w:r>
         <w:rPr>
           <w:rFonts w:ascii="Courier New" w:hAnsi="Courier New" w:cs="Courier New"/>
           <w:sz w:val="20"/>
           <w:szCs w:val="20"/>
         </w:rPr>
-        <w:t xml:space="preserve"> &lt;&lt; Optional</w:t>
-      </w:r>
-    </w:p>
-    <w:p>
-      <w:pPr>
-        <w:pStyle w:val="textbody"/>
+        <w:t>3</w:t>
+      </w:r>
+      <w:r>
         <w:rPr>
           <w:rFonts w:ascii="Courier New" w:hAnsi="Courier New" w:cs="Courier New"/>
           <w:sz w:val="20"/>
           <w:szCs w:val="20"/>
         </w:rPr>
-      </w:pPr>
+        <w:tab/>
+      </w:r>
       <w:r>
         <w:rPr>
           <w:rFonts w:ascii="Courier New" w:hAnsi="Courier New" w:cs="Courier New"/>
           <w:sz w:val="20"/>
           <w:szCs w:val="20"/>
         </w:rPr>
-        <w:t>3</w:t>
+        <w:tab/>
+        <w:t>LtIgnitions</w:t>
       </w:r>
       <w:r>
         <w:rPr>
@@ -13015,42 +12817,42 @@
           <w:sz w:val="20"/>
           <w:szCs w:val="20"/>
         </w:rPr>
-        <w:tab/>
-      </w:r>
-      <w:r>
+        <w:t xml:space="preserve">3.img </w:t>
+      </w:r>
+    </w:p>
+    <w:p>
+      <w:pPr>
+        <w:pStyle w:val="textbody"/>
         <w:rPr>
           <w:rFonts w:ascii="Courier New" w:hAnsi="Courier New" w:cs="Courier New"/>
           <w:sz w:val="20"/>
           <w:szCs w:val="20"/>
         </w:rPr>
-        <w:tab/>
-        <w:t>LtIgnitions</w:t>
-      </w:r>
+      </w:pPr>
       <w:r>
         <w:rPr>
           <w:rFonts w:ascii="Courier New" w:hAnsi="Courier New" w:cs="Courier New"/>
           <w:sz w:val="20"/>
           <w:szCs w:val="20"/>
         </w:rPr>
-        <w:t xml:space="preserve">3.img </w:t>
-      </w:r>
-    </w:p>
-    <w:p>
-      <w:pPr>
-        <w:pStyle w:val="textbody"/>
+        <w:t>5</w:t>
+      </w:r>
+      <w:r>
         <w:rPr>
           <w:rFonts w:ascii="Courier New" w:hAnsi="Courier New" w:cs="Courier New"/>
           <w:sz w:val="20"/>
           <w:szCs w:val="20"/>
         </w:rPr>
-      </w:pPr>
+        <w:tab/>
+      </w:r>
       <w:r>
         <w:rPr>
           <w:rFonts w:ascii="Courier New" w:hAnsi="Courier New" w:cs="Courier New"/>
           <w:sz w:val="20"/>
           <w:szCs w:val="20"/>
         </w:rPr>
-        <w:t>5</w:t>
+        <w:tab/>
+        <w:t>LtIgnitions5</w:t>
       </w:r>
       <w:r>
         <w:rPr>
@@ -13058,42 +12860,42 @@
           <w:sz w:val="20"/>
           <w:szCs w:val="20"/>
         </w:rPr>
-        <w:tab/>
-      </w:r>
-      <w:r>
+        <w:t xml:space="preserve">.img </w:t>
+      </w:r>
+    </w:p>
+    <w:p>
+      <w:pPr>
+        <w:pStyle w:val="textbody"/>
         <w:rPr>
           <w:rFonts w:ascii="Courier New" w:hAnsi="Courier New" w:cs="Courier New"/>
           <w:sz w:val="20"/>
           <w:szCs w:val="20"/>
         </w:rPr>
-        <w:tab/>
-        <w:t>LtIgnitions5</w:t>
-      </w:r>
+      </w:pPr>
       <w:r>
         <w:rPr>
           <w:rFonts w:ascii="Courier New" w:hAnsi="Courier New" w:cs="Courier New"/>
           <w:sz w:val="20"/>
           <w:szCs w:val="20"/>
         </w:rPr>
-        <w:t xml:space="preserve">.img </w:t>
-      </w:r>
-    </w:p>
-    <w:p>
-      <w:pPr>
-        <w:pStyle w:val="textbody"/>
+        <w:t>13</w:t>
+      </w:r>
+      <w:r>
         <w:rPr>
           <w:rFonts w:ascii="Courier New" w:hAnsi="Courier New" w:cs="Courier New"/>
           <w:sz w:val="20"/>
           <w:szCs w:val="20"/>
         </w:rPr>
-      </w:pPr>
+        <w:tab/>
+      </w:r>
       <w:r>
         <w:rPr>
           <w:rFonts w:ascii="Courier New" w:hAnsi="Courier New" w:cs="Courier New"/>
           <w:sz w:val="20"/>
           <w:szCs w:val="20"/>
         </w:rPr>
-        <w:t>13</w:t>
+        <w:tab/>
+        <w:t>LtIgnitions1</w:t>
       </w:r>
       <w:r>
         <w:rPr>
@@ -13101,111 +12903,105 @@
           <w:sz w:val="20"/>
           <w:szCs w:val="20"/>
         </w:rPr>
-        <w:tab/>
-      </w:r>
-      <w:r>
+        <w:t>3.img</w:t>
+      </w:r>
+    </w:p>
+    <w:p>
+      <w:pPr>
+        <w:pStyle w:val="Heading2"/>
+        <w:spacing w:after="120"/>
+      </w:pPr>
+      <w:bookmarkStart w:id="45" w:name="_Toc235010975"/>
+      <w:r>
+        <w:t>RxIgnitionsMap</w:t>
+      </w:r>
+      <w:bookmarkEnd w:id="45"/>
+    </w:p>
+    <w:p>
+      <w:pPr>
+        <w:pStyle w:val="textbody"/>
+      </w:pPr>
+      <w:r>
+        <w:t xml:space="preserve">This parameter specifies a raster map </w:t>
+      </w:r>
+      <w:r>
+        <w:t xml:space="preserve">that ranks </w:t>
+      </w:r>
+      <w:r>
+        <w:t xml:space="preserve">where prescribed fire </w:t>
+      </w:r>
+      <w:r>
+        <w:t xml:space="preserve">will </w:t>
+      </w:r>
+      <w:r>
+        <w:t xml:space="preserve">occur.  </w:t>
+      </w:r>
+      <w:r>
+        <w:t>See the entry for Accidental Ignitions Map for further details.</w:t>
+      </w:r>
+    </w:p>
+    <w:p>
+      <w:pPr>
+        <w:pStyle w:val="Heading2"/>
+        <w:spacing w:after="120"/>
+      </w:pPr>
+      <w:bookmarkStart w:id="46" w:name="_Toc235010976"/>
+      <w:r>
+        <w:t>DynamicRxIgnitionMaps (Optional)</w:t>
+      </w:r>
+      <w:bookmarkEnd w:id="46"/>
+    </w:p>
+    <w:p>
+      <w:pPr>
+        <w:pStyle w:val="textbody"/>
+      </w:pPr>
+      <w:r>
+        <w:t xml:space="preserve">This </w:t>
+      </w:r>
+      <w:r>
+        <w:rPr>
+          <w:b/>
+        </w:rPr>
+        <w:t>optional table</w:t>
+      </w:r>
+      <w:r>
+        <w:t xml:space="preserve"> allows you to change prescribed fire ignition maps for any given year.  The table contains </w:t>
+      </w:r>
+      <w:r>
+        <w:rPr>
+          <w:b/>
+        </w:rPr>
+        <w:t>simulation year</w:t>
+      </w:r>
+      <w:r>
+        <w:t xml:space="preserve"> and </w:t>
+      </w:r>
+      <w:r>
+        <w:rPr>
+          <w:b/>
+        </w:rPr>
+        <w:t>map name</w:t>
+      </w:r>
+      <w:r>
+        <w:t>, each pair on a separate line.</w:t>
+      </w:r>
+    </w:p>
+    <w:p>
+      <w:pPr>
+        <w:pStyle w:val="textbody"/>
         <w:rPr>
           <w:rFonts w:ascii="Courier New" w:hAnsi="Courier New" w:cs="Courier New"/>
           <w:sz w:val="20"/>
           <w:szCs w:val="20"/>
         </w:rPr>
-        <w:tab/>
-        <w:t>LtIgnitions1</w:t>
-      </w:r>
+      </w:pPr>
       <w:r>
         <w:rPr>
           <w:rFonts w:ascii="Courier New" w:hAnsi="Courier New" w:cs="Courier New"/>
           <w:sz w:val="20"/>
           <w:szCs w:val="20"/>
         </w:rPr>
-        <w:t>3.img</w:t>
-      </w:r>
-    </w:p>
-    <w:p>
-      <w:pPr>
-        <w:pStyle w:val="Heading2"/>
-        <w:spacing w:after="120"/>
-      </w:pPr>
-      <w:bookmarkStart w:id="45" w:name="_Toc235010975"/>
-      <w:proofErr w:type="spellStart"/>
-      <w:r>
-        <w:t>RxIgnitionsMap</w:t>
-      </w:r>
-      <w:bookmarkEnd w:id="45"/>
-      <w:proofErr w:type="spellEnd"/>
-    </w:p>
-    <w:p>
-      <w:pPr>
-        <w:pStyle w:val="textbody"/>
-      </w:pPr>
-      <w:r>
-        <w:t xml:space="preserve">This parameter specifies a raster map </w:t>
-      </w:r>
-      <w:r>
-        <w:t xml:space="preserve">that ranks </w:t>
-      </w:r>
-      <w:r>
-        <w:t xml:space="preserve">where prescribed fire </w:t>
-      </w:r>
-      <w:r>
-        <w:t xml:space="preserve">will </w:t>
-      </w:r>
-      <w:r>
-        <w:t xml:space="preserve">occur.  </w:t>
-      </w:r>
-      <w:r>
-        <w:t>See the entry for Accidental Ignitions Map for further details.</w:t>
-      </w:r>
-    </w:p>
-    <w:p>
-      <w:pPr>
-        <w:pStyle w:val="Heading2"/>
-        <w:spacing w:after="120"/>
-      </w:pPr>
-      <w:bookmarkStart w:id="46" w:name="_Toc235010976"/>
-      <w:proofErr w:type="spellStart"/>
-      <w:r>
-        <w:t>DynamicRxIgnitionMaps</w:t>
-      </w:r>
-      <w:proofErr w:type="spellEnd"/>
-      <w:r>
-        <w:t xml:space="preserve"> (Optional)</w:t>
-      </w:r>
-      <w:bookmarkEnd w:id="46"/>
-    </w:p>
-    <w:p>
-      <w:pPr>
-        <w:pStyle w:val="textbody"/>
-      </w:pPr>
-      <w:r>
-        <w:t xml:space="preserve">This </w:t>
-      </w:r>
-      <w:r>
-        <w:rPr>
-          <w:b/>
-        </w:rPr>
-        <w:t>optional table</w:t>
-      </w:r>
-      <w:r>
-        <w:t xml:space="preserve"> allows you to change prescribed fire ignition maps for any given year.  The table contains </w:t>
-      </w:r>
-      <w:r>
-        <w:rPr>
-          <w:b/>
-        </w:rPr>
-        <w:t>simulation year</w:t>
-      </w:r>
-      <w:r>
-        <w:t xml:space="preserve"> and </w:t>
-      </w:r>
-      <w:r>
-        <w:rPr>
-          <w:b/>
-        </w:rPr>
-        <w:t>map name</w:t>
-      </w:r>
-      <w:r>
-        <w:t>, each pair on a separate line.</w:t>
+        <w:t>DynamicRxIgnitionMaps &lt;&lt; Optional</w:t>
       </w:r>
     </w:p>
     <w:p>
@@ -13217,58 +13013,56 @@
           <w:szCs w:val="20"/>
         </w:rPr>
       </w:pPr>
-      <w:proofErr w:type="spellStart"/>
       <w:r>
         <w:rPr>
           <w:rFonts w:ascii="Courier New" w:hAnsi="Courier New" w:cs="Courier New"/>
           <w:sz w:val="20"/>
           <w:szCs w:val="20"/>
         </w:rPr>
-        <w:t>DynamicRxIgnitionMaps</w:t>
-      </w:r>
-      <w:proofErr w:type="spellEnd"/>
+        <w:t>3</w:t>
+      </w:r>
       <w:r>
         <w:rPr>
           <w:rFonts w:ascii="Courier New" w:hAnsi="Courier New" w:cs="Courier New"/>
           <w:sz w:val="20"/>
           <w:szCs w:val="20"/>
         </w:rPr>
-        <w:t xml:space="preserve"> &lt;&lt; Optional</w:t>
-      </w:r>
-    </w:p>
-    <w:p>
-      <w:pPr>
-        <w:pStyle w:val="textbody"/>
+        <w:tab/>
+      </w:r>
+      <w:r>
         <w:rPr>
           <w:rFonts w:ascii="Courier New" w:hAnsi="Courier New" w:cs="Courier New"/>
           <w:sz w:val="20"/>
           <w:szCs w:val="20"/>
         </w:rPr>
-      </w:pPr>
+        <w:tab/>
+        <w:t>RxIgnitions</w:t>
+      </w:r>
       <w:r>
         <w:rPr>
           <w:rFonts w:ascii="Courier New" w:hAnsi="Courier New" w:cs="Courier New"/>
           <w:sz w:val="20"/>
           <w:szCs w:val="20"/>
         </w:rPr>
-        <w:t>3</w:t>
-      </w:r>
-      <w:r>
+        <w:t xml:space="preserve">3.img </w:t>
+      </w:r>
+    </w:p>
+    <w:p>
+      <w:pPr>
+        <w:pStyle w:val="textbody"/>
         <w:rPr>
           <w:rFonts w:ascii="Courier New" w:hAnsi="Courier New" w:cs="Courier New"/>
           <w:sz w:val="20"/>
           <w:szCs w:val="20"/>
         </w:rPr>
-        <w:tab/>
-      </w:r>
+      </w:pPr>
       <w:r>
         <w:rPr>
           <w:rFonts w:ascii="Courier New" w:hAnsi="Courier New" w:cs="Courier New"/>
           <w:sz w:val="20"/>
           <w:szCs w:val="20"/>
         </w:rPr>
-        <w:tab/>
-        <w:t>RxIgnitions</w:t>
+        <w:t>5</w:t>
       </w:r>
       <w:r>
         <w:rPr>
@@ -13276,42 +13070,42 @@
           <w:sz w:val="20"/>
           <w:szCs w:val="20"/>
         </w:rPr>
-        <w:t xml:space="preserve">3.img </w:t>
-      </w:r>
-    </w:p>
-    <w:p>
-      <w:pPr>
-        <w:pStyle w:val="textbody"/>
+        <w:tab/>
+      </w:r>
+      <w:r>
         <w:rPr>
           <w:rFonts w:ascii="Courier New" w:hAnsi="Courier New" w:cs="Courier New"/>
           <w:sz w:val="20"/>
           <w:szCs w:val="20"/>
         </w:rPr>
-      </w:pPr>
+        <w:tab/>
+        <w:t>RxIgnitions5</w:t>
+      </w:r>
       <w:r>
         <w:rPr>
           <w:rFonts w:ascii="Courier New" w:hAnsi="Courier New" w:cs="Courier New"/>
           <w:sz w:val="20"/>
           <w:szCs w:val="20"/>
         </w:rPr>
-        <w:t>5</w:t>
-      </w:r>
-      <w:r>
+        <w:t xml:space="preserve">.img </w:t>
+      </w:r>
+    </w:p>
+    <w:p>
+      <w:pPr>
+        <w:pStyle w:val="textbody"/>
         <w:rPr>
           <w:rFonts w:ascii="Courier New" w:hAnsi="Courier New" w:cs="Courier New"/>
           <w:sz w:val="20"/>
           <w:szCs w:val="20"/>
         </w:rPr>
-        <w:tab/>
-      </w:r>
+      </w:pPr>
       <w:r>
         <w:rPr>
           <w:rFonts w:ascii="Courier New" w:hAnsi="Courier New" w:cs="Courier New"/>
           <w:sz w:val="20"/>
           <w:szCs w:val="20"/>
         </w:rPr>
-        <w:tab/>
-        <w:t>RxIgnitions5</w:t>
+        <w:t>13</w:t>
       </w:r>
       <w:r>
         <w:rPr>
@@ -13319,42 +13113,186 @@
           <w:sz w:val="20"/>
           <w:szCs w:val="20"/>
         </w:rPr>
-        <w:t xml:space="preserve">.img </w:t>
-      </w:r>
-    </w:p>
-    <w:p>
-      <w:pPr>
-        <w:pStyle w:val="textbody"/>
+        <w:tab/>
+      </w:r>
+      <w:r>
         <w:rPr>
           <w:rFonts w:ascii="Courier New" w:hAnsi="Courier New" w:cs="Courier New"/>
           <w:sz w:val="20"/>
           <w:szCs w:val="20"/>
         </w:rPr>
-      </w:pPr>
+        <w:tab/>
+        <w:t>RxIgnitions1</w:t>
+      </w:r>
       <w:r>
         <w:rPr>
           <w:rFonts w:ascii="Courier New" w:hAnsi="Courier New" w:cs="Courier New"/>
           <w:sz w:val="20"/>
           <w:szCs w:val="20"/>
         </w:rPr>
-        <w:t>13</w:t>
-      </w:r>
-      <w:r>
+        <w:t>3.img</w:t>
+      </w:r>
+    </w:p>
+    <w:p>
+      <w:pPr>
+        <w:pStyle w:val="Heading2"/>
+        <w:spacing w:after="120"/>
+      </w:pPr>
+      <w:bookmarkStart w:id="47" w:name="_Toc235010977"/>
+      <w:r>
+        <w:lastRenderedPageBreak/>
+        <w:t>AccidentalSuppressionMap</w:t>
+      </w:r>
+      <w:bookmarkEnd w:id="47"/>
+    </w:p>
+    <w:p>
+      <w:pPr>
+        <w:pStyle w:val="textbody"/>
+      </w:pPr>
+      <w:r>
+        <w:t>This parameter specifies a raster map to represent where and how accidental fires are suppressed.  The map units are integers and should only include:  0, 1, 2, 3, indicating no suppression, light, moderate, and maximal suppression</w:t>
+      </w:r>
+      <w:r>
+        <w:t xml:space="preserve"> </w:t>
+      </w:r>
+      <w:r>
+        <w:t>is possible. This relates to the possible suppression probabilities listed in 2.5</w:t>
+      </w:r>
+      <w:r>
+        <w:t>5</w:t>
+      </w:r>
+      <w:r>
+        <w:t xml:space="preserve"> SuppresionTable.   </w:t>
+      </w:r>
+    </w:p>
+    <w:p>
+      <w:pPr>
+        <w:pStyle w:val="Heading2"/>
+        <w:spacing w:after="120"/>
+      </w:pPr>
+      <w:bookmarkStart w:id="48" w:name="_Toc235010978"/>
+      <w:r>
+        <w:t>LightningSuppressionMap</w:t>
+      </w:r>
+      <w:bookmarkEnd w:id="48"/>
+    </w:p>
+    <w:p>
+      <w:pPr>
+        <w:pStyle w:val="textbody"/>
+      </w:pPr>
+      <w:r>
+        <w:t>This parameter specifies a raster map to represent where and how lightning fires are suppressed.  The map units are integers and should only include:  0, 1, 2, 3, indicating no suppression, light, moderate, and maximal suppression</w:t>
+      </w:r>
+      <w:r>
+        <w:t xml:space="preserve"> </w:t>
+      </w:r>
+      <w:r>
+        <w:t>is possible. This relates to the possible suppression probabilities listed in 2.5</w:t>
+      </w:r>
+      <w:r>
+        <w:t>5</w:t>
+      </w:r>
+      <w:r>
+        <w:t xml:space="preserve"> SuppresionTable.   </w:t>
+      </w:r>
+      <w:r>
+        <w:t xml:space="preserve"> </w:t>
+      </w:r>
+    </w:p>
+    <w:p>
+      <w:pPr>
+        <w:pStyle w:val="Heading2"/>
+        <w:spacing w:after="120"/>
+      </w:pPr>
+      <w:bookmarkStart w:id="49" w:name="_Toc235010979"/>
+      <w:r>
+        <w:t>RxSuppressionMap</w:t>
+      </w:r>
+      <w:bookmarkEnd w:id="49"/>
+    </w:p>
+    <w:p>
+      <w:pPr>
+        <w:pStyle w:val="textbody"/>
+      </w:pPr>
+      <w:r>
+        <w:t>This parameter specifies a raster map to represent where and how prescribed fires are suppressed.  The map units are integers and should only include:  0, 1, 2, 3, indicating no suppression, light, moderate, and maximal suppression</w:t>
+      </w:r>
+      <w:r>
+        <w:t xml:space="preserve"> </w:t>
+      </w:r>
+      <w:r>
+        <w:t>is possible. This relates to the possible suppression probabilities listed in 2.5</w:t>
+      </w:r>
+      <w:r>
+        <w:t>5</w:t>
+      </w:r>
+      <w:r>
+        <w:t xml:space="preserve"> SuppresionTable.   </w:t>
+      </w:r>
+    </w:p>
+    <w:p>
+      <w:pPr>
+        <w:pStyle w:val="Heading2"/>
+        <w:spacing w:after="120"/>
+      </w:pPr>
+      <w:bookmarkStart w:id="50" w:name="_Toc235010980"/>
+      <w:bookmarkStart w:id="51" w:name="_Ref272935732"/>
+      <w:r>
+        <w:t>DynamicAccidentalSuppressionMaps (Optional)</w:t>
+      </w:r>
+      <w:bookmarkEnd w:id="50"/>
+    </w:p>
+    <w:p>
+      <w:pPr>
+        <w:pStyle w:val="textbody"/>
+      </w:pPr>
+      <w:r>
+        <w:t xml:space="preserve">This </w:t>
+      </w:r>
+      <w:r>
+        <w:rPr>
+          <w:b/>
+        </w:rPr>
+        <w:t>optional table</w:t>
+      </w:r>
+      <w:r>
+        <w:t xml:space="preserve"> allows you to change accidental suppression maps for any given year.  The table contains </w:t>
+      </w:r>
+      <w:r>
+        <w:rPr>
+          <w:b/>
+        </w:rPr>
+        <w:t>simulation year</w:t>
+      </w:r>
+      <w:r>
+        <w:t xml:space="preserve"> and </w:t>
+      </w:r>
+      <w:r>
+        <w:rPr>
+          <w:b/>
+        </w:rPr>
+        <w:t>map name</w:t>
+      </w:r>
+      <w:r>
+        <w:t>, each pair on a separate line.</w:t>
+      </w:r>
+    </w:p>
+    <w:p>
+      <w:pPr>
+        <w:pStyle w:val="textbody"/>
         <w:rPr>
           <w:rFonts w:ascii="Courier New" w:hAnsi="Courier New" w:cs="Courier New"/>
           <w:sz w:val="20"/>
           <w:szCs w:val="20"/>
         </w:rPr>
-        <w:tab/>
-      </w:r>
+      </w:pPr>
       <w:r>
         <w:rPr>
           <w:rFonts w:ascii="Courier New" w:hAnsi="Courier New" w:cs="Courier New"/>
           <w:sz w:val="20"/>
           <w:szCs w:val="20"/>
         </w:rPr>
-        <w:tab/>
-        <w:t>RxIgnitions1</w:t>
+        <w:t>Dynamic</w:t>
       </w:r>
       <w:r>
         <w:rPr>
@@ -13362,213 +13300,33 @@
           <w:sz w:val="20"/>
           <w:szCs w:val="20"/>
         </w:rPr>
-        <w:t>3.img</w:t>
-      </w:r>
-    </w:p>
-    <w:p>
-      <w:pPr>
-        <w:pStyle w:val="Heading2"/>
-        <w:spacing w:after="120"/>
-      </w:pPr>
-      <w:bookmarkStart w:id="47" w:name="_Toc235010977"/>
-      <w:proofErr w:type="spellStart"/>
-      <w:r>
-        <w:lastRenderedPageBreak/>
-        <w:t>AccidentalSuppressionMap</w:t>
-      </w:r>
-      <w:bookmarkEnd w:id="47"/>
-      <w:proofErr w:type="spellEnd"/>
-    </w:p>
-    <w:p>
-      <w:pPr>
-        <w:pStyle w:val="textbody"/>
-      </w:pPr>
-      <w:r>
-        <w:t>This parameter specifies a raster map to represent where and how accidental fires are suppressed.  The map units are integers and should only include:  0, 1, 2, 3, indicating no suppression, light, moderate, and maximal suppression</w:t>
-      </w:r>
-      <w:r>
-        <w:t xml:space="preserve"> </w:t>
-      </w:r>
-      <w:r>
-        <w:t>is possible. This relates to the possible suppression probabilities listed in 2.5</w:t>
-      </w:r>
-      <w:r>
-        <w:t>5</w:t>
-      </w:r>
-      <w:r>
-        <w:t xml:space="preserve"> </w:t>
-      </w:r>
-      <w:proofErr w:type="spellStart"/>
-      <w:r>
-        <w:t>SuppresionTable</w:t>
-      </w:r>
-      <w:proofErr w:type="spellEnd"/>
-      <w:r>
-        <w:t xml:space="preserve">.   </w:t>
-      </w:r>
-    </w:p>
-    <w:p>
-      <w:pPr>
-        <w:pStyle w:val="Heading2"/>
-        <w:spacing w:after="120"/>
-      </w:pPr>
-      <w:bookmarkStart w:id="48" w:name="_Toc235010978"/>
-      <w:proofErr w:type="spellStart"/>
-      <w:r>
-        <w:t>LightningSuppressionMap</w:t>
-      </w:r>
-      <w:bookmarkEnd w:id="48"/>
-      <w:proofErr w:type="spellEnd"/>
-    </w:p>
-    <w:p>
-      <w:pPr>
-        <w:pStyle w:val="textbody"/>
-      </w:pPr>
-      <w:r>
-        <w:t>This parameter specifies a raster map to represent where and how lightning fires are suppressed.  The map units are integers and should only include:  0, 1, 2, 3, indicating no suppression, light, moderate, and maximal suppression</w:t>
-      </w:r>
-      <w:r>
-        <w:t xml:space="preserve"> </w:t>
-      </w:r>
-      <w:r>
-        <w:t>is possible. This relates to the possible suppression probabilities listed in 2.5</w:t>
-      </w:r>
-      <w:r>
-        <w:t>5</w:t>
-      </w:r>
-      <w:r>
-        <w:t xml:space="preserve"> </w:t>
-      </w:r>
-      <w:proofErr w:type="spellStart"/>
-      <w:r>
-        <w:t>SuppresionTable</w:t>
-      </w:r>
-      <w:proofErr w:type="spellEnd"/>
-      <w:r>
-        <w:t xml:space="preserve">.   </w:t>
-      </w:r>
-      <w:r>
-        <w:t xml:space="preserve"> </w:t>
-      </w:r>
-    </w:p>
-    <w:p>
-      <w:pPr>
-        <w:pStyle w:val="Heading2"/>
-        <w:spacing w:after="120"/>
-      </w:pPr>
-      <w:bookmarkStart w:id="49" w:name="_Toc235010979"/>
-      <w:proofErr w:type="spellStart"/>
-      <w:r>
-        <w:t>RxSuppressionMap</w:t>
-      </w:r>
-      <w:bookmarkEnd w:id="49"/>
-      <w:proofErr w:type="spellEnd"/>
-    </w:p>
-    <w:p>
-      <w:pPr>
-        <w:pStyle w:val="textbody"/>
-      </w:pPr>
-      <w:r>
-        <w:t>This parameter specifies a raster map to represent where and how prescribed fires are suppressed.  The map units are integers and should only include:  0, 1, 2, 3, indicating no suppression, light, moderate, and maximal suppression</w:t>
-      </w:r>
-      <w:r>
-        <w:t xml:space="preserve"> </w:t>
-      </w:r>
-      <w:r>
-        <w:t>is possible. This relates to the possible suppression probabilities listed in 2.5</w:t>
-      </w:r>
-      <w:r>
-        <w:t>5</w:t>
-      </w:r>
-      <w:r>
-        <w:t xml:space="preserve"> </w:t>
-      </w:r>
-      <w:proofErr w:type="spellStart"/>
-      <w:r>
-        <w:t>SuppresionTable</w:t>
-      </w:r>
-      <w:proofErr w:type="spellEnd"/>
-      <w:r>
-        <w:t xml:space="preserve">.   </w:t>
-      </w:r>
-    </w:p>
-    <w:p>
-      <w:pPr>
-        <w:pStyle w:val="Heading2"/>
-        <w:spacing w:after="120"/>
-      </w:pPr>
-      <w:bookmarkStart w:id="50" w:name="_Ref272935732"/>
-      <w:bookmarkStart w:id="51" w:name="_Toc235010980"/>
-      <w:proofErr w:type="spellStart"/>
-      <w:r>
-        <w:t>DynamicAccidentalSuppressionMaps</w:t>
-      </w:r>
-      <w:proofErr w:type="spellEnd"/>
-      <w:r>
-        <w:t xml:space="preserve"> (Optional)</w:t>
-      </w:r>
-      <w:bookmarkEnd w:id="51"/>
-    </w:p>
-    <w:p>
-      <w:pPr>
-        <w:pStyle w:val="textbody"/>
-      </w:pPr>
-      <w:r>
-        <w:t xml:space="preserve">This </w:t>
-      </w:r>
-      <w:r>
-        <w:rPr>
-          <w:b/>
-        </w:rPr>
-        <w:t>optional table</w:t>
-      </w:r>
-      <w:r>
-        <w:t xml:space="preserve"> allows you to change accidental suppression maps for any given year.  The table contains </w:t>
-      </w:r>
-      <w:r>
-        <w:rPr>
-          <w:b/>
-        </w:rPr>
-        <w:t>simulation year</w:t>
-      </w:r>
-      <w:r>
-        <w:t xml:space="preserve"> and </w:t>
-      </w:r>
-      <w:r>
-        <w:rPr>
-          <w:b/>
-        </w:rPr>
-        <w:t>map name</w:t>
-      </w:r>
-      <w:r>
-        <w:t>, each pair on a separate line.</w:t>
-      </w:r>
-    </w:p>
-    <w:p>
-      <w:pPr>
-        <w:pStyle w:val="textbody"/>
+        <w:t>AccidentalSuppression</w:t>
+      </w:r>
+      <w:r>
         <w:rPr>
           <w:rFonts w:ascii="Courier New" w:hAnsi="Courier New" w:cs="Courier New"/>
           <w:sz w:val="20"/>
           <w:szCs w:val="20"/>
         </w:rPr>
-      </w:pPr>
-      <w:proofErr w:type="spellStart"/>
-      <w:r>
+        <w:t>Maps &lt;&lt; Optional</w:t>
+      </w:r>
+    </w:p>
+    <w:p>
+      <w:pPr>
+        <w:pStyle w:val="textbody"/>
         <w:rPr>
           <w:rFonts w:ascii="Courier New" w:hAnsi="Courier New" w:cs="Courier New"/>
           <w:sz w:val="20"/>
           <w:szCs w:val="20"/>
         </w:rPr>
-        <w:t>Dynamic</w:t>
-      </w:r>
+      </w:pPr>
       <w:r>
         <w:rPr>
           <w:rFonts w:ascii="Courier New" w:hAnsi="Courier New" w:cs="Courier New"/>
           <w:sz w:val="20"/>
           <w:szCs w:val="20"/>
         </w:rPr>
-        <w:t>AccidentalSuppression</w:t>
+        <w:t>3</w:t>
       </w:r>
       <w:r>
         <w:rPr>
@@ -13576,42 +13334,42 @@
           <w:sz w:val="20"/>
           <w:szCs w:val="20"/>
         </w:rPr>
-        <w:t>Maps</w:t>
-      </w:r>
-      <w:proofErr w:type="spellEnd"/>
+        <w:tab/>
+      </w:r>
       <w:r>
         <w:rPr>
           <w:rFonts w:ascii="Courier New" w:hAnsi="Courier New" w:cs="Courier New"/>
           <w:sz w:val="20"/>
           <w:szCs w:val="20"/>
         </w:rPr>
-        <w:t xml:space="preserve"> &lt;&lt; Optional</w:t>
-      </w:r>
-    </w:p>
-    <w:p>
-      <w:pPr>
-        <w:pStyle w:val="textbody"/>
+        <w:tab/>
+        <w:t>AccSupp</w:t>
+      </w:r>
+      <w:r>
         <w:rPr>
           <w:rFonts w:ascii="Courier New" w:hAnsi="Courier New" w:cs="Courier New"/>
           <w:sz w:val="20"/>
           <w:szCs w:val="20"/>
         </w:rPr>
-      </w:pPr>
-      <w:r>
+        <w:t xml:space="preserve">3.img </w:t>
+      </w:r>
+    </w:p>
+    <w:p>
+      <w:pPr>
+        <w:pStyle w:val="textbody"/>
         <w:rPr>
           <w:rFonts w:ascii="Courier New" w:hAnsi="Courier New" w:cs="Courier New"/>
           <w:sz w:val="20"/>
           <w:szCs w:val="20"/>
         </w:rPr>
-        <w:t>3</w:t>
-      </w:r>
+      </w:pPr>
       <w:r>
         <w:rPr>
           <w:rFonts w:ascii="Courier New" w:hAnsi="Courier New" w:cs="Courier New"/>
           <w:sz w:val="20"/>
           <w:szCs w:val="20"/>
         </w:rPr>
-        <w:tab/>
+        <w:t>5</w:t>
       </w:r>
       <w:r>
         <w:rPr>
@@ -13620,7 +13378,6 @@
           <w:szCs w:val="20"/>
         </w:rPr>
         <w:tab/>
-        <w:t>AccSupp</w:t>
       </w:r>
       <w:r>
         <w:rPr>
@@ -13628,33 +13385,34 @@
           <w:sz w:val="20"/>
           <w:szCs w:val="20"/>
         </w:rPr>
-        <w:t xml:space="preserve">3.img </w:t>
-      </w:r>
-    </w:p>
-    <w:p>
-      <w:pPr>
-        <w:pStyle w:val="textbody"/>
+        <w:tab/>
+        <w:t>AccSupp5</w:t>
+      </w:r>
+      <w:r>
         <w:rPr>
           <w:rFonts w:ascii="Courier New" w:hAnsi="Courier New" w:cs="Courier New"/>
           <w:sz w:val="20"/>
           <w:szCs w:val="20"/>
         </w:rPr>
-      </w:pPr>
-      <w:r>
+        <w:t xml:space="preserve">.img </w:t>
+      </w:r>
+    </w:p>
+    <w:p>
+      <w:pPr>
+        <w:pStyle w:val="textbody"/>
         <w:rPr>
           <w:rFonts w:ascii="Courier New" w:hAnsi="Courier New" w:cs="Courier New"/>
           <w:sz w:val="20"/>
           <w:szCs w:val="20"/>
         </w:rPr>
-        <w:t>5</w:t>
-      </w:r>
+      </w:pPr>
       <w:r>
         <w:rPr>
           <w:rFonts w:ascii="Courier New" w:hAnsi="Courier New" w:cs="Courier New"/>
           <w:sz w:val="20"/>
           <w:szCs w:val="20"/>
         </w:rPr>
-        <w:tab/>
+        <w:t>13</w:t>
       </w:r>
       <w:r>
         <w:rPr>
@@ -13663,7 +13421,6 @@
           <w:szCs w:val="20"/>
         </w:rPr>
         <w:tab/>
-        <w:t>AccSupp5</w:t>
       </w:r>
       <w:r>
         <w:rPr>
@@ -13671,49 +13428,15 @@
           <w:sz w:val="20"/>
           <w:szCs w:val="20"/>
         </w:rPr>
-        <w:t xml:space="preserve">.img </w:t>
-      </w:r>
-    </w:p>
-    <w:p>
-      <w:pPr>
-        <w:pStyle w:val="textbody"/>
+        <w:tab/>
+        <w:t>AccSupp1</w:t>
+      </w:r>
+      <w:r>
         <w:rPr>
           <w:rFonts w:ascii="Courier New" w:hAnsi="Courier New" w:cs="Courier New"/>
           <w:sz w:val="20"/>
           <w:szCs w:val="20"/>
         </w:rPr>
-      </w:pPr>
-      <w:r>
-        <w:rPr>
-          <w:rFonts w:ascii="Courier New" w:hAnsi="Courier New" w:cs="Courier New"/>
-          <w:sz w:val="20"/>
-          <w:szCs w:val="20"/>
-        </w:rPr>
-        <w:t>13</w:t>
-      </w:r>
-      <w:r>
-        <w:rPr>
-          <w:rFonts w:ascii="Courier New" w:hAnsi="Courier New" w:cs="Courier New"/>
-          <w:sz w:val="20"/>
-          <w:szCs w:val="20"/>
-        </w:rPr>
-        <w:tab/>
-      </w:r>
-      <w:r>
-        <w:rPr>
-          <w:rFonts w:ascii="Courier New" w:hAnsi="Courier New" w:cs="Courier New"/>
-          <w:sz w:val="20"/>
-          <w:szCs w:val="20"/>
-        </w:rPr>
-        <w:tab/>
-        <w:t>AccSupp1</w:t>
-      </w:r>
-      <w:r>
-        <w:rPr>
-          <w:rFonts w:ascii="Courier New" w:hAnsi="Courier New" w:cs="Courier New"/>
-          <w:sz w:val="20"/>
-          <w:szCs w:val="20"/>
-        </w:rPr>
         <w:t>3.img</w:t>
       </w:r>
     </w:p>
@@ -13723,16 +13446,14 @@
         <w:spacing w:after="120"/>
       </w:pPr>
       <w:bookmarkStart w:id="52" w:name="_Toc235010981"/>
-      <w:proofErr w:type="spellStart"/>
       <w:r>
         <w:t>GroundSlopeFile</w:t>
       </w:r>
       <w:bookmarkEnd w:id="52"/>
-      <w:proofErr w:type="spellEnd"/>
       <w:r>
         <w:t xml:space="preserve"> </w:t>
       </w:r>
-      <w:bookmarkEnd w:id="50"/>
+      <w:bookmarkEnd w:id="51"/>
     </w:p>
     <w:p>
       <w:pPr>
@@ -13770,13 +13491,11 @@
       </w:pPr>
       <w:bookmarkStart w:id="53" w:name="_Ref272935725"/>
       <w:bookmarkStart w:id="54" w:name="_Toc235010982"/>
-      <w:proofErr w:type="spellStart"/>
       <w:r>
         <w:t>UphillSlopeAzimuthMap</w:t>
       </w:r>
       <w:bookmarkEnd w:id="53"/>
       <w:bookmarkEnd w:id="54"/>
-      <w:proofErr w:type="spellEnd"/>
     </w:p>
     <w:p>
       <w:pPr>
@@ -13913,12 +13632,10 @@
         <w:pStyle w:val="Heading2"/>
       </w:pPr>
       <w:bookmarkStart w:id="60" w:name="_Toc235010988"/>
-      <w:proofErr w:type="spellStart"/>
       <w:r>
         <w:t>IgnitionDistribution</w:t>
       </w:r>
       <w:bookmarkEnd w:id="60"/>
-      <w:proofErr w:type="spellEnd"/>
     </w:p>
     <w:p>
       <w:pPr>
@@ -13927,11 +13644,9 @@
       <w:r>
         <w:t xml:space="preserve">This parameter indicates to the model which ignition sub-model you are using either, </w:t>
       </w:r>
-      <w:proofErr w:type="spellStart"/>
       <w:r>
         <w:t>ZeroInflatedPoisson</w:t>
       </w:r>
-      <w:proofErr w:type="spellEnd"/>
       <w:r>
         <w:t xml:space="preserve"> or Poisson</w:t>
       </w:r>
@@ -14050,28 +13765,18 @@
         <w:spacing w:after="120"/>
       </w:pPr>
       <w:bookmarkStart w:id="65" w:name="_Toc235010993"/>
-      <w:proofErr w:type="spellStart"/>
       <w:r>
         <w:lastRenderedPageBreak/>
         <w:t>MaximumFineFuels</w:t>
       </w:r>
       <w:bookmarkEnd w:id="65"/>
-      <w:proofErr w:type="spellEnd"/>
     </w:p>
     <w:p>
       <w:pPr>
         <w:pStyle w:val="textbody"/>
       </w:pPr>
       <w:r>
-        <w:t xml:space="preserve">This is the maximum </w:t>
-      </w:r>
-      <w:proofErr w:type="gramStart"/>
-      <w:r>
-        <w:t>amount</w:t>
-      </w:r>
-      <w:proofErr w:type="gramEnd"/>
-      <w:r>
-        <w:t xml:space="preserve"> of fine fuels (g m</w:t>
+        <w:t>This is the maximum amount of fine fuels (g m</w:t>
       </w:r>
       <w:r>
         <w:rPr>
@@ -14158,19 +13863,32 @@
         <w:spacing w:after="120"/>
       </w:pPr>
       <w:bookmarkStart w:id="66" w:name="_Toc235010994"/>
-      <w:proofErr w:type="spellStart"/>
       <w:r>
         <w:t>MaximumRxWindSpeed</w:t>
       </w:r>
       <w:bookmarkEnd w:id="66"/>
-      <w:proofErr w:type="spellEnd"/>
     </w:p>
     <w:p>
       <w:pPr>
         <w:pStyle w:val="textbody"/>
       </w:pPr>
       <w:r>
-        <w:t xml:space="preserve">The maximum wind speed under which prescribed fires will be </w:t>
+        <w:t xml:space="preserve">The maximum wind speed </w:t>
+      </w:r>
+      <w:r>
+        <w:t>(m second</w:t>
+      </w:r>
+      <w:r>
+        <w:rPr>
+          <w:vertAlign w:val="superscript"/>
+        </w:rPr>
+        <w:t>-1</w:t>
+      </w:r>
+      <w:r>
+        <w:t xml:space="preserve">) </w:t>
+      </w:r>
+      <w:r>
+        <w:t xml:space="preserve">under which prescribed fires will be </w:t>
       </w:r>
       <w:r>
         <w:t xml:space="preserve">ignited </w:t>
@@ -14185,11 +13903,9 @@
         <w:spacing w:after="120"/>
       </w:pPr>
       <w:bookmarkStart w:id="67" w:name="_Toc235010995"/>
-      <w:proofErr w:type="spellStart"/>
       <w:r>
         <w:t>MaximumRxFireWeatherIndex</w:t>
       </w:r>
-      <w:proofErr w:type="spellEnd"/>
       <w:r>
         <w:t xml:space="preserve"> (Optional)</w:t>
       </w:r>
@@ -14209,11 +13925,9 @@
         <w:spacing w:after="120"/>
       </w:pPr>
       <w:bookmarkStart w:id="68" w:name="_Toc235010996"/>
-      <w:proofErr w:type="spellStart"/>
       <w:r>
         <w:t>MinimumRxFireWeatherIndex</w:t>
       </w:r>
-      <w:proofErr w:type="spellEnd"/>
       <w:r>
         <w:t xml:space="preserve"> (Optional)</w:t>
       </w:r>
@@ -14224,15 +13938,7 @@
         <w:pStyle w:val="textbody"/>
       </w:pPr>
       <w:r>
-        <w:t xml:space="preserve">The minimum Fire Weather Index under which prescribed fires will be put on the landscape.  </w:t>
-      </w:r>
-      <w:proofErr w:type="gramStart"/>
-      <w:r>
-        <w:t>Typically</w:t>
-      </w:r>
-      <w:proofErr w:type="gramEnd"/>
-      <w:r>
-        <w:t xml:space="preserve"> prescribed fires will </w:t>
+        <w:t xml:space="preserve">The minimum Fire Weather Index under which prescribed fires will be put on the landscape.  Typically prescribed fires will </w:t>
       </w:r>
       <w:r>
         <w:rPr>
@@ -14250,34 +13956,21 @@
         <w:spacing w:after="120"/>
       </w:pPr>
       <w:bookmarkStart w:id="69" w:name="EcoTable"/>
-      <w:bookmarkStart w:id="70" w:name="_Toc136162638"/>
-      <w:bookmarkStart w:id="71" w:name="_Toc235010997"/>
-      <w:bookmarkEnd w:id="43"/>
+      <w:bookmarkStart w:id="70" w:name="_Toc235010997"/>
+      <w:bookmarkStart w:id="71" w:name="_Toc136162638"/>
+      <w:bookmarkEnd w:id="44"/>
       <w:bookmarkEnd w:id="69"/>
-      <w:proofErr w:type="spellStart"/>
-      <w:r>
-        <w:t>MaximumRxTemperture</w:t>
-      </w:r>
-      <w:proofErr w:type="spellEnd"/>
-      <w:r>
-        <w:t xml:space="preserve"> (Optional)</w:t>
-      </w:r>
-      <w:bookmarkEnd w:id="71"/>
+      <w:r>
+        <w:t>MaximumRxTemperture (Optional)</w:t>
+      </w:r>
+      <w:bookmarkEnd w:id="70"/>
     </w:p>
     <w:p>
       <w:pPr>
         <w:pStyle w:val="textbody"/>
       </w:pPr>
       <w:r>
-        <w:t xml:space="preserve">The maximum temperature (Celsius) under which prescribed fires </w:t>
-      </w:r>
-      <w:proofErr w:type="gramStart"/>
-      <w:r>
-        <w:t>will occur</w:t>
-      </w:r>
-      <w:proofErr w:type="gramEnd"/>
-      <w:r>
-        <w:t>.</w:t>
+        <w:t>The maximum temperature (Celsius) under which prescribed fires will occur.</w:t>
       </w:r>
     </w:p>
     <w:p>
@@ -14286,13 +13979,8 @@
         <w:spacing w:after="120"/>
       </w:pPr>
       <w:bookmarkStart w:id="72" w:name="_Toc235010998"/>
-      <w:proofErr w:type="spellStart"/>
-      <w:r>
-        <w:t>MinimumRxRelativeHumidity</w:t>
-      </w:r>
-      <w:proofErr w:type="spellEnd"/>
-      <w:r>
-        <w:t xml:space="preserve"> (Optional)</w:t>
+      <w:r>
+        <w:t>MinimumRxRelativeHumidity (Optional)</w:t>
       </w:r>
       <w:bookmarkEnd w:id="72"/>
     </w:p>
@@ -14310,7 +13998,6 @@
         <w:spacing w:after="120"/>
       </w:pPr>
       <w:bookmarkStart w:id="73" w:name="_Toc235010999"/>
-      <w:proofErr w:type="spellStart"/>
       <w:r>
         <w:t>MaximumRXFireInte</w:t>
       </w:r>
@@ -14321,7 +14008,6 @@
         <w:t>ity</w:t>
       </w:r>
       <w:bookmarkEnd w:id="73"/>
-      <w:proofErr w:type="spellEnd"/>
     </w:p>
     <w:p>
       <w:pPr>
@@ -14353,13 +14039,8 @@
         </w:rPr>
         <w:t>Note</w:t>
       </w:r>
-      <w:proofErr w:type="gramStart"/>
-      <w:r>
-        <w:t>:  Although</w:t>
-      </w:r>
-      <w:proofErr w:type="gramEnd"/>
-      <w:r>
-        <w:t xml:space="preserve"> the meaning has changed to fire severity, the keyword remains the same.</w:t>
+      <w:r>
+        <w:t>:  Although the meaning has changed to fire severity, the keyword remains the same.</w:t>
       </w:r>
     </w:p>
     <w:p>
@@ -14368,12 +14049,10 @@
         <w:spacing w:after="120"/>
       </w:pPr>
       <w:bookmarkStart w:id="74" w:name="_Toc235011000"/>
-      <w:proofErr w:type="spellStart"/>
       <w:r>
         <w:t>NumberRxAnnualFires</w:t>
       </w:r>
       <w:bookmarkEnd w:id="74"/>
-      <w:proofErr w:type="spellEnd"/>
     </w:p>
     <w:p>
       <w:pPr>
@@ -14389,12 +14068,10 @@
         <w:spacing w:after="120"/>
       </w:pPr>
       <w:bookmarkStart w:id="75" w:name="_Toc235011001"/>
-      <w:proofErr w:type="spellStart"/>
       <w:r>
         <w:t>NumberRxDailyFires</w:t>
       </w:r>
       <w:bookmarkEnd w:id="75"/>
-      <w:proofErr w:type="spellEnd"/>
     </w:p>
     <w:p>
       <w:pPr>
@@ -14410,28 +14087,18 @@
         <w:spacing w:after="120"/>
       </w:pPr>
       <w:bookmarkStart w:id="76" w:name="_Toc235011002"/>
-      <w:proofErr w:type="spellStart"/>
       <w:r>
         <w:lastRenderedPageBreak/>
         <w:t>FirstDayRxFires</w:t>
       </w:r>
       <w:bookmarkEnd w:id="76"/>
-      <w:proofErr w:type="spellEnd"/>
     </w:p>
     <w:p>
       <w:pPr>
         <w:pStyle w:val="textbody"/>
       </w:pPr>
       <w:r>
-        <w:t xml:space="preserve">The first Julian day </w:t>
-      </w:r>
-      <w:proofErr w:type="gramStart"/>
-      <w:r>
-        <w:t>in</w:t>
-      </w:r>
-      <w:proofErr w:type="gramEnd"/>
-      <w:r>
-        <w:t xml:space="preserve"> which a prescribed fire can begin.  This is important if fall burning is preferred over spring burning.</w:t>
+        <w:t>The first Julian day in which a prescribed fire can begin.  This is important if fall burning is preferred over spring burning.</w:t>
       </w:r>
     </w:p>
     <w:p>
@@ -14440,27 +14107,17 @@
         <w:spacing w:after="120"/>
       </w:pPr>
       <w:bookmarkStart w:id="77" w:name="_Toc235011003"/>
-      <w:proofErr w:type="spellStart"/>
       <w:r>
         <w:t>LastDayRxFires</w:t>
       </w:r>
       <w:bookmarkEnd w:id="77"/>
-      <w:proofErr w:type="spellEnd"/>
     </w:p>
     <w:p>
       <w:pPr>
         <w:pStyle w:val="textbody"/>
       </w:pPr>
       <w:r>
-        <w:t xml:space="preserve">The last Julian day </w:t>
-      </w:r>
-      <w:proofErr w:type="gramStart"/>
-      <w:r>
-        <w:t>in</w:t>
-      </w:r>
-      <w:proofErr w:type="gramEnd"/>
-      <w:r>
-        <w:t xml:space="preserve"> which a prescribed fire can begin.  </w:t>
+        <w:t xml:space="preserve">The last Julian day in which a prescribed fire can begin.  </w:t>
       </w:r>
     </w:p>
     <w:p>
@@ -14469,27 +14126,17 @@
         <w:spacing w:after="120"/>
       </w:pPr>
       <w:bookmarkStart w:id="78" w:name="_Toc235011004"/>
-      <w:proofErr w:type="spellStart"/>
       <w:r>
         <w:t>TargetRxSize</w:t>
       </w:r>
       <w:bookmarkEnd w:id="78"/>
-      <w:proofErr w:type="spellEnd"/>
     </w:p>
     <w:p>
       <w:pPr>
         <w:pStyle w:val="textbody"/>
       </w:pPr>
       <w:r>
-        <w:t xml:space="preserve">The maximum size for a prescribed fire </w:t>
-      </w:r>
-      <w:proofErr w:type="gramStart"/>
-      <w:r>
-        <w:t>in</w:t>
-      </w:r>
-      <w:proofErr w:type="gramEnd"/>
-      <w:r>
-        <w:t xml:space="preserve"> hectares.</w:t>
+        <w:t>The maximum size for a prescribed fire in hectares.</w:t>
       </w:r>
     </w:p>
     <w:p>
@@ -14498,13 +14145,8 @@
         <w:spacing w:after="120"/>
       </w:pPr>
       <w:bookmarkStart w:id="79" w:name="_Toc235011005"/>
-      <w:proofErr w:type="spellStart"/>
-      <w:r>
-        <w:t>RxZonesMap</w:t>
-      </w:r>
-      <w:proofErr w:type="spellEnd"/>
-      <w:r>
-        <w:t xml:space="preserve"> (Optional)</w:t>
+      <w:r>
+        <w:t>RxZonesMap (Optional)</w:t>
       </w:r>
       <w:bookmarkEnd w:id="79"/>
     </w:p>
@@ -14524,14 +14166,12 @@
       <w:r>
         <w:t xml:space="preserve"> creates stands for prescribed fires. A prescribed fire will burn only within the zone (stand) within which it starts.  It will NOT burn into other zones.  The size remains limited by </w:t>
       </w:r>
-      <w:proofErr w:type="spellStart"/>
       <w:r>
         <w:rPr>
           <w:b/>
         </w:rPr>
         <w:t>TargetRxSize</w:t>
       </w:r>
-      <w:proofErr w:type="spellEnd"/>
       <w:r>
         <w:t>.</w:t>
       </w:r>
@@ -14703,15 +14343,7 @@
         <w:pStyle w:val="textbody"/>
       </w:pPr>
       <w:r>
-        <w:t>Note</w:t>
-      </w:r>
-      <w:proofErr w:type="gramStart"/>
-      <w:r>
-        <w:t>:  The</w:t>
-      </w:r>
-      <w:proofErr w:type="gramEnd"/>
-      <w:r>
-        <w:t xml:space="preserve"> climate library converts all wind speed units into </w:t>
+        <w:t xml:space="preserve">Note:  The climate library converts all wind speed units into </w:t>
       </w:r>
       <w:r>
         <w:rPr>
@@ -14939,13 +14571,8 @@
         <w:spacing w:after="120"/>
       </w:pPr>
       <w:bookmarkStart w:id="87" w:name="_Toc235011013"/>
-      <w:proofErr w:type="spellStart"/>
-      <w:r>
-        <w:t>BurningSitesThreshold</w:t>
-      </w:r>
-      <w:proofErr w:type="spellEnd"/>
-      <w:r>
-        <w:t xml:space="preserve"> (optional integer)</w:t>
+      <w:r>
+        <w:t>BurningSitesThreshold (optional integer)</w:t>
       </w:r>
       <w:bookmarkEnd w:id="87"/>
     </w:p>
@@ -15035,15 +14662,7 @@
         <w:pStyle w:val="textbody"/>
       </w:pPr>
       <w:r>
-        <w:t>Note</w:t>
-      </w:r>
-      <w:proofErr w:type="gramStart"/>
-      <w:r>
-        <w:t>:  The</w:t>
-      </w:r>
-      <w:proofErr w:type="gramEnd"/>
-      <w:r>
-        <w:t xml:space="preserve"> climate library converts all wind speed units into </w:t>
+        <w:t xml:space="preserve">Note:  The climate library converts all wind speed units into </w:t>
       </w:r>
       <w:r>
         <w:rPr>
@@ -15179,14 +14798,12 @@
         </w:numPr>
         <w:spacing w:after="120"/>
       </w:pPr>
-      <w:bookmarkStart w:id="98" w:name="_Toc48384081"/>
-      <w:bookmarkStart w:id="99" w:name="_Toc235011024"/>
-      <w:proofErr w:type="spellStart"/>
+      <w:bookmarkStart w:id="98" w:name="_Toc235011024"/>
+      <w:bookmarkStart w:id="99" w:name="_Toc48384081"/>
       <w:r>
         <w:t>LadderFuelMaxAge</w:t>
       </w:r>
-      <w:bookmarkEnd w:id="99"/>
-      <w:proofErr w:type="spellEnd"/>
+      <w:bookmarkEnd w:id="98"/>
     </w:p>
     <w:p>
       <w:pPr>
@@ -15195,25 +14812,21 @@
       <w:r>
         <w:t xml:space="preserve">May determine site-level mortality. The maximum age at which a cohort is still considered a ladder fuel, i.e., the cohort is a ladder fuel until reaching this age.  The biomass of all cohorts ≥ </w:t>
       </w:r>
-      <w:proofErr w:type="spellStart"/>
       <w:r>
         <w:rPr>
           <w:rFonts w:ascii="Courier New" w:hAnsi="Courier New" w:cs="Courier New"/>
         </w:rPr>
         <w:t>LadderFuelMaxAge</w:t>
       </w:r>
-      <w:proofErr w:type="spellEnd"/>
       <w:r>
         <w:t xml:space="preserve"> listed in </w:t>
       </w:r>
-      <w:proofErr w:type="spellStart"/>
       <w:r>
         <w:rPr>
           <w:rFonts w:ascii="Courier New" w:hAnsi="Courier New" w:cs="Courier New"/>
         </w:rPr>
         <w:t>LadderFuelSpeciesList</w:t>
       </w:r>
-      <w:proofErr w:type="spellEnd"/>
       <w:r>
         <w:t xml:space="preserve"> are summed.</w:t>
       </w:r>
@@ -15228,28 +14841,18 @@
         <w:spacing w:after="120"/>
       </w:pPr>
       <w:bookmarkStart w:id="100" w:name="_Toc235011025"/>
-      <w:proofErr w:type="spellStart"/>
       <w:r>
         <w:t>LadderFuelSpeciesList</w:t>
       </w:r>
-      <w:bookmarkEnd w:id="98"/>
+      <w:bookmarkEnd w:id="99"/>
       <w:bookmarkEnd w:id="100"/>
-      <w:proofErr w:type="spellEnd"/>
     </w:p>
     <w:p>
       <w:pPr>
         <w:pStyle w:val="textbody"/>
       </w:pPr>
       <w:r>
-        <w:t xml:space="preserve">A list of species codes for species that are considered ladder fuels.  Conifers are typically considered ladder </w:t>
-      </w:r>
-      <w:proofErr w:type="gramStart"/>
-      <w:r>
-        <w:t>fuels</w:t>
-      </w:r>
-      <w:proofErr w:type="gramEnd"/>
-      <w:r>
-        <w:t xml:space="preserve"> but rhododendrons and other shrubs may also act as ladder fuels.</w:t>
+        <w:t>A list of species codes for species that are considered ladder fuels.  Conifers are typically considered ladder fuels but rhododendrons and other shrubs may also act as ladder fuels.</w:t>
       </w:r>
     </w:p>
     <w:p>
@@ -15258,13 +14861,11 @@
         <w:spacing w:after="120"/>
       </w:pPr>
       <w:bookmarkStart w:id="101" w:name="_Toc235011026"/>
-      <w:proofErr w:type="spellStart"/>
       <w:r>
         <w:lastRenderedPageBreak/>
         <w:t>SuppressionMaxWindSpeed</w:t>
       </w:r>
       <w:bookmarkEnd w:id="101"/>
-      <w:proofErr w:type="spellEnd"/>
     </w:p>
     <w:p>
       <w:pPr>
@@ -15292,7 +14893,6 @@
         <w:spacing w:after="120"/>
       </w:pPr>
       <w:bookmarkStart w:id="102" w:name="_Toc235011027"/>
-      <w:proofErr w:type="spellStart"/>
       <w:r>
         <w:t>Suppression</w:t>
       </w:r>
@@ -15300,7 +14900,6 @@
         <w:t>_CSV_File</w:t>
       </w:r>
       <w:bookmarkEnd w:id="102"/>
-      <w:proofErr w:type="spellEnd"/>
     </w:p>
     <w:p>
       <w:pPr>
@@ -15314,36 +14913,16 @@
       <w:pPr>
         <w:pStyle w:val="textbody"/>
       </w:pPr>
-      <w:proofErr w:type="spellStart"/>
-      <w:r>
-        <w:t>IgnitionType</w:t>
-      </w:r>
-      <w:proofErr w:type="spellEnd"/>
-      <w:proofErr w:type="gramStart"/>
-      <w:r>
-        <w:t>:  Accidental</w:t>
-      </w:r>
-      <w:proofErr w:type="gramEnd"/>
-      <w:r>
-        <w:t>, Lightning, or Rx (text input)</w:t>
+      <w:r>
+        <w:t>IgnitionType:  Accidental, Lightning, or Rx (text input)</w:t>
       </w:r>
     </w:p>
     <w:p>
       <w:pPr>
         <w:pStyle w:val="textbody"/>
       </w:pPr>
-      <w:proofErr w:type="spellStart"/>
-      <w:r>
-        <w:t>Mapcode</w:t>
-      </w:r>
-      <w:proofErr w:type="spellEnd"/>
-      <w:proofErr w:type="gramStart"/>
-      <w:r>
-        <w:t>:  The</w:t>
-      </w:r>
-      <w:proofErr w:type="gramEnd"/>
-      <w:r>
-        <w:t xml:space="preserve"> map code in the corresponding suppression map (integer)</w:t>
+      <w:r>
+        <w:t>Mapcode:  The map code in the corresponding suppression map (integer)</w:t>
       </w:r>
     </w:p>
     <w:p>
@@ -15351,15 +14930,7 @@
         <w:pStyle w:val="textbody"/>
       </w:pPr>
       <w:r>
-        <w:t xml:space="preserve">Suppress_Category_0:  </w:t>
-      </w:r>
-      <w:proofErr w:type="gramStart"/>
-      <w:r>
-        <w:t>The  suppression</w:t>
-      </w:r>
-      <w:proofErr w:type="gramEnd"/>
-      <w:r>
-        <w:t xml:space="preserve"> effort, given a FWI &lt; FWI_Break_1</w:t>
+        <w:t>Suppress_Category_0:  The  suppression effort, given a FWI &lt; FWI_Break_1</w:t>
       </w:r>
       <w:r>
         <w:t xml:space="preserve"> (integer). Suppression effort defines how much the probability of spread is reduced by suppression, e.g., 5%, 65%, 95%, and reflects the resources that would be committed to suppression under low fire risk, moderate fire risk, and high fire risk (as defined by the two FWI break points). </w:t>
@@ -15373,15 +14944,7 @@
         <w:pStyle w:val="textbody"/>
       </w:pPr>
       <w:r>
-        <w:t>FWI_Break_1</w:t>
-      </w:r>
-      <w:proofErr w:type="gramStart"/>
-      <w:r>
-        <w:t>:  The</w:t>
-      </w:r>
-      <w:proofErr w:type="gramEnd"/>
-      <w:r>
-        <w:t xml:space="preserve"> daily FWI that defines the highest FWI for suppression category 0 (integer)</w:t>
+        <w:t>FWI_Break_1:  The daily FWI that defines the highest FWI for suppression category 0 (integer)</w:t>
       </w:r>
     </w:p>
     <w:p>
@@ -15389,16 +14952,11 @@
         <w:pStyle w:val="textbody"/>
       </w:pPr>
       <w:r>
-        <w:t>Suppress_Category_1</w:t>
-      </w:r>
-      <w:proofErr w:type="gramStart"/>
-      <w:r>
-        <w:t xml:space="preserve">:  </w:t>
+        <w:t xml:space="preserve">Suppress_Category_1:  </w:t>
       </w:r>
       <w:r>
         <w:t>The</w:t>
       </w:r>
-      <w:proofErr w:type="gramEnd"/>
       <w:r>
         <w:t xml:space="preserve"> </w:t>
       </w:r>
@@ -15411,15 +14969,7 @@
         <w:pStyle w:val="textbody"/>
       </w:pPr>
       <w:r>
-        <w:t>FWI_Break_2</w:t>
-      </w:r>
-      <w:proofErr w:type="gramStart"/>
-      <w:r>
-        <w:t>:  The</w:t>
-      </w:r>
-      <w:proofErr w:type="gramEnd"/>
-      <w:r>
-        <w:t xml:space="preserve"> daily FWI that defines the highest FWI for suppression category 1 (integer)</w:t>
+        <w:t>FWI_Break_2:  The daily FWI that defines the highest FWI for suppression category 1 (integer)</w:t>
       </w:r>
     </w:p>
     <w:p>
@@ -15427,15 +14977,7 @@
         <w:pStyle w:val="textbody"/>
       </w:pPr>
       <w:r>
-        <w:t>Suppress_Category_2</w:t>
-      </w:r>
-      <w:proofErr w:type="gramStart"/>
-      <w:r>
-        <w:t>:  The</w:t>
-      </w:r>
-      <w:proofErr w:type="gramEnd"/>
-      <w:r>
-        <w:t xml:space="preserve"> suppression effort, given a FWI &gt; FWI_Break_2 (integer)</w:t>
+        <w:t>Suppress_Category_2:  The suppression effort, given a FWI &gt; FWI_Break_2 (integer)</w:t>
       </w:r>
     </w:p>
     <w:p>
@@ -15472,13 +15014,11 @@
       </w:pPr>
       <w:bookmarkStart w:id="103" w:name="_Toc48384084"/>
       <w:bookmarkStart w:id="104" w:name="_Toc235011028"/>
-      <w:proofErr w:type="spellStart"/>
       <w:r>
         <w:t>DeadWoodTable</w:t>
       </w:r>
       <w:bookmarkEnd w:id="103"/>
       <w:bookmarkEnd w:id="104"/>
-      <w:proofErr w:type="spellEnd"/>
     </w:p>
     <w:p>
       <w:pPr>
@@ -15495,14 +15035,12 @@
           <w:rFonts w:ascii="Courier New" w:hAnsi="Courier New" w:cs="Courier New"/>
         </w:rPr>
       </w:pPr>
-      <w:proofErr w:type="spellStart"/>
       <w:r>
         <w:rPr>
           <w:rFonts w:ascii="Courier New" w:hAnsi="Courier New" w:cs="Courier New"/>
         </w:rPr>
         <w:t>DeadWoodTable</w:t>
       </w:r>
-      <w:proofErr w:type="spellEnd"/>
     </w:p>
     <w:p>
       <w:pPr>
@@ -15511,14 +15049,12 @@
           <w:rFonts w:ascii="Courier New" w:hAnsi="Courier New" w:cs="Courier New"/>
         </w:rPr>
       </w:pPr>
-      <w:proofErr w:type="spellStart"/>
       <w:r>
         <w:rPr>
           <w:rFonts w:ascii="Courier New" w:hAnsi="Courier New" w:cs="Courier New"/>
         </w:rPr>
         <w:t>PinuJeff</w:t>
       </w:r>
-      <w:proofErr w:type="spellEnd"/>
       <w:r>
         <w:rPr>
           <w:rFonts w:ascii="Courier New" w:hAnsi="Courier New" w:cs="Courier New"/>
@@ -15593,7 +15129,6 @@
                 <w:szCs w:val="16"/>
               </w:rPr>
             </w:pPr>
-            <w:proofErr w:type="spellStart"/>
             <w:r>
               <w:rPr>
                 <w:sz w:val="16"/>
@@ -15615,7 +15150,6 @@
               </w:rPr>
               <w:t>nitionType</w:t>
             </w:r>
-            <w:proofErr w:type="spellEnd"/>
           </w:p>
         </w:tc>
         <w:tc>
@@ -15634,7 +15168,6 @@
                 <w:szCs w:val="16"/>
               </w:rPr>
             </w:pPr>
-            <w:proofErr w:type="spellStart"/>
             <w:r>
               <w:rPr>
                 <w:sz w:val="16"/>
@@ -15642,7 +15175,6 @@
               </w:rPr>
               <w:t>Mapcode</w:t>
             </w:r>
-            <w:proofErr w:type="spellEnd"/>
           </w:p>
         </w:tc>
         <w:tc>
@@ -17401,7 +16933,7 @@
       <w:bookmarkStart w:id="105" w:name="_Toc102232960"/>
       <w:bookmarkStart w:id="106" w:name="_Toc136162695"/>
       <w:bookmarkStart w:id="107" w:name="_Toc235011029"/>
-      <w:bookmarkEnd w:id="70"/>
+      <w:bookmarkEnd w:id="71"/>
       <w:r>
         <w:lastRenderedPageBreak/>
         <w:t>Output Files</w:t>
@@ -17420,11 +16952,9 @@
       <w:r>
         <w:t xml:space="preserve">assist with model calibration, </w:t>
       </w:r>
-      <w:proofErr w:type="gramStart"/>
       <w:r>
         <w:t>parameterize</w:t>
       </w:r>
-      <w:proofErr w:type="gramEnd"/>
       <w:r>
         <w:t xml:space="preserve">, and to </w:t>
       </w:r>
@@ -17446,52 +16976,28 @@
         <w:pStyle w:val="Heading2"/>
         <w:spacing w:after="120"/>
       </w:pPr>
-      <w:bookmarkStart w:id="108" w:name="_Toc102232961"/>
-      <w:bookmarkStart w:id="109" w:name="_Ref133900246"/>
-      <w:bookmarkStart w:id="110" w:name="_Toc136162696"/>
-      <w:bookmarkStart w:id="111" w:name="_Ref272935798"/>
-      <w:bookmarkStart w:id="112" w:name="_Toc235011030"/>
+      <w:bookmarkStart w:id="108" w:name="_Toc235011030"/>
+      <w:bookmarkStart w:id="109" w:name="_Toc102232961"/>
+      <w:bookmarkStart w:id="110" w:name="_Ref133900246"/>
+      <w:bookmarkStart w:id="111" w:name="_Toc136162696"/>
+      <w:bookmarkStart w:id="112" w:name="_Ref272935798"/>
       <w:r>
         <w:t>Day of Fire Map</w:t>
       </w:r>
       <w:r>
         <w:t>s</w:t>
       </w:r>
-      <w:bookmarkEnd w:id="112"/>
+      <w:bookmarkEnd w:id="108"/>
     </w:p>
     <w:p>
       <w:pPr>
         <w:pStyle w:val="textbody"/>
       </w:pPr>
       <w:r>
-        <w:t xml:space="preserve">The map of ‘fire </w:t>
-      </w:r>
-      <w:proofErr w:type="gramStart"/>
-      <w:r>
-        <w:t>days’</w:t>
-      </w:r>
-      <w:proofErr w:type="gramEnd"/>
-      <w:r>
-        <w:t xml:space="preserve"> tracks on which day of the year a cell </w:t>
-      </w:r>
-      <w:proofErr w:type="gramStart"/>
-      <w:r>
-        <w:t>burned</w:t>
-      </w:r>
-      <w:proofErr w:type="gramEnd"/>
-      <w:r>
-        <w:t>. Map values equal Julian day of time step.</w:t>
-      </w:r>
-      <w:r>
-        <w:t xml:space="preserve">  Note</w:t>
-      </w:r>
-      <w:proofErr w:type="gramStart"/>
-      <w:r>
-        <w:t>:  map</w:t>
-      </w:r>
-      <w:proofErr w:type="gramEnd"/>
-      <w:r>
-        <w:t xml:space="preserve"> values = 0 indicates an inactive site; 1 = active but unburned; &gt; 1 = Day-of-year for the fire + 1.</w:t>
+        <w:t>The map of ‘fire days’ tracks on which day of the year a cell burned. Map values equal Julian day of time step.</w:t>
+      </w:r>
+      <w:r>
+        <w:t xml:space="preserve">  Note:  map values = 0 indicates an inactive site; 1 = active but unburned; &gt; 1 = Day-of-year for the fire + 1.</w:t>
       </w:r>
     </w:p>
     <w:p>
@@ -17509,13 +17015,13 @@
       <w:r>
         <w:t>Map</w:t>
       </w:r>
-      <w:bookmarkEnd w:id="108"/>
       <w:bookmarkEnd w:id="109"/>
+      <w:bookmarkEnd w:id="110"/>
       <w:r>
         <w:t>s</w:t>
       </w:r>
-      <w:bookmarkEnd w:id="110"/>
       <w:bookmarkEnd w:id="111"/>
+      <w:bookmarkEnd w:id="112"/>
       <w:bookmarkEnd w:id="113"/>
     </w:p>
     <w:p>
@@ -17543,13 +17049,8 @@
       <w:r>
         <w:t xml:space="preserve"> Map values: 0 = </w:t>
       </w:r>
-      <w:proofErr w:type="gramStart"/>
-      <w:r>
-        <w:t>Non-active</w:t>
-      </w:r>
-      <w:proofErr w:type="gramEnd"/>
-      <w:r>
-        <w:t>; 1=</w:t>
+      <w:r>
+        <w:t>Non-active; 1=</w:t>
       </w:r>
       <w:r>
         <w:t>Unburned site</w:t>
@@ -17578,14 +17079,14 @@
         <w:pStyle w:val="Heading2"/>
         <w:spacing w:after="120"/>
       </w:pPr>
-      <w:bookmarkStart w:id="114" w:name="_Ref133900608"/>
-      <w:bookmarkStart w:id="115" w:name="_Toc136162697"/>
-      <w:bookmarkStart w:id="116" w:name="_Toc102232962"/>
-      <w:bookmarkStart w:id="117" w:name="_Toc235011032"/>
+      <w:bookmarkStart w:id="114" w:name="_Toc235011032"/>
+      <w:bookmarkStart w:id="115" w:name="_Ref133900608"/>
+      <w:bookmarkStart w:id="116" w:name="_Toc136162697"/>
+      <w:bookmarkStart w:id="117" w:name="_Toc102232962"/>
       <w:r>
         <w:t>Fire Spread Probability Maps</w:t>
       </w:r>
-      <w:bookmarkEnd w:id="117"/>
+      <w:bookmarkEnd w:id="114"/>
     </w:p>
     <w:p>
       <w:pPr>
@@ -17759,15 +17260,7 @@
         <w:pStyle w:val="textbody"/>
       </w:pPr>
       <w:r>
-        <w:t xml:space="preserve">Raster files of the </w:t>
-      </w:r>
-      <w:proofErr w:type="spellStart"/>
-      <w:r>
-        <w:t>dNBR</w:t>
-      </w:r>
-      <w:proofErr w:type="spellEnd"/>
-      <w:r>
-        <w:t xml:space="preserve"> (</w:t>
+        <w:t>Raster files of the dNBR (</w:t>
       </w:r>
       <w:r>
         <w:t>differenced Normalized Burn Ratio</w:t>
@@ -17868,15 +17361,7 @@
         <w:t>s</w:t>
       </w:r>
       <w:r>
-        <w:t xml:space="preserve"> the relationship between attempted FWI and number of fire ignitions for each type</w:t>
-      </w:r>
-      <w:proofErr w:type="gramStart"/>
-      <w:r>
-        <w:t>, for</w:t>
-      </w:r>
-      <w:proofErr w:type="gramEnd"/>
-      <w:r>
-        <w:t xml:space="preserve"> each day and year.</w:t>
+        <w:t xml:space="preserve"> the relationship between attempted FWI and number of fire ignitions for each type, for each day and year.</w:t>
       </w:r>
       <w:r>
         <w:t xml:space="preserve"> </w:t>
@@ -17897,8 +17382,8 @@
       <w:r>
         <w:t>Fire Event Log</w:t>
       </w:r>
-      <w:bookmarkEnd w:id="114"/>
       <w:bookmarkEnd w:id="115"/>
+      <w:bookmarkEnd w:id="116"/>
       <w:r>
         <w:t xml:space="preserve"> (CSV)</w:t>
       </w:r>
@@ -18179,7 +17664,7 @@
       <w:r>
         <w:t xml:space="preserve"> Log</w:t>
       </w:r>
-      <w:bookmarkEnd w:id="116"/>
+      <w:bookmarkEnd w:id="117"/>
       <w:bookmarkEnd w:id="128"/>
       <w:bookmarkEnd w:id="129"/>
       <w:r>
@@ -18288,15 +17773,7 @@
         <w:spacing w:after="0"/>
       </w:pPr>
       <w:r>
-        <w:t xml:space="preserve">number of </w:t>
-      </w:r>
-      <w:proofErr w:type="gramStart"/>
-      <w:r>
-        <w:t>lighting</w:t>
-      </w:r>
-      <w:proofErr w:type="gramEnd"/>
-      <w:r>
-        <w:t xml:space="preserve"> ignited fires</w:t>
+        <w:t>number of lighting ignited fires</w:t>
       </w:r>
     </w:p>
     <w:p>

</xml_diff>